<commit_message>
ottimizzazione ricerca e stelle mezze
</commit_message>
<xml_diff>
--- a/LAB-B-main/LAB-B-main/doc/Manuale Utente FINE.docx
+++ b/LAB-B-main/LAB-B-main/doc/Manuale Utente FINE.docx
@@ -200,37 +200,30 @@
         <w:p>
           <w:pPr>
             <w:pStyle w:val="Sommario1"/>
+            <w:jc w:val="both"/>
             <w:rPr>
               <w:rFonts w:eastAsiaTheme="minorEastAsia"/>
-              <w:b w:val="0"/>
-              <w:bCs w:val="0"/>
             </w:rPr>
           </w:pPr>
           <w:r>
             <w:rPr>
               <w:rFonts w:ascii="Times New Roman" w:hAnsi="Times New Roman" w:cs="Times New Roman"/>
-              <w:b w:val="0"/>
-              <w:bCs w:val="0"/>
             </w:rPr>
             <w:fldChar w:fldCharType="begin"/>
           </w:r>
           <w:r>
             <w:rPr>
               <w:rFonts w:ascii="Times New Roman" w:hAnsi="Times New Roman" w:cs="Times New Roman"/>
-              <w:b w:val="0"/>
-              <w:bCs w:val="0"/>
             </w:rPr>
             <w:instrText xml:space="preserve"> TOC \o "1-3" \h \z \u </w:instrText>
           </w:r>
           <w:r>
             <w:rPr>
               <w:rFonts w:ascii="Times New Roman" w:hAnsi="Times New Roman" w:cs="Times New Roman"/>
-              <w:b w:val="0"/>
-              <w:bCs w:val="0"/>
             </w:rPr>
             <w:fldChar w:fldCharType="separate"/>
           </w:r>
-          <w:hyperlink w:anchor="_Toc198550506" w:history="1">
+          <w:hyperlink w:anchor="_Toc198636604" w:history="1">
             <w:r>
               <w:rPr>
                 <w:rStyle w:val="Collegamentoipertestuale"/>
@@ -241,8 +234,6 @@
             <w:r>
               <w:rPr>
                 <w:rFonts w:eastAsiaTheme="minorEastAsia"/>
-                <w:b w:val="0"/>
-                <w:bCs w:val="0"/>
               </w:rPr>
               <w:tab/>
             </w:r>
@@ -269,7 +260,7 @@
               <w:rPr>
                 <w:webHidden/>
               </w:rPr>
-              <w:instrText xml:space="preserve"> PAGEREF _Toc198550506 \h </w:instrText>
+              <w:instrText xml:space="preserve"> PAGEREF _Toc198636604 \h </w:instrText>
             </w:r>
             <w:r>
               <w:rPr>
@@ -299,13 +290,12 @@
         <w:p>
           <w:pPr>
             <w:pStyle w:val="Sommario1"/>
+            <w:jc w:val="both"/>
             <w:rPr>
               <w:rFonts w:eastAsiaTheme="minorEastAsia"/>
-              <w:b w:val="0"/>
-              <w:bCs w:val="0"/>
             </w:rPr>
           </w:pPr>
-          <w:hyperlink w:anchor="_Toc198550507" w:history="1">
+          <w:hyperlink w:anchor="_Toc198636605" w:history="1">
             <w:r>
               <w:rPr>
                 <w:rStyle w:val="Collegamentoipertestuale"/>
@@ -316,8 +306,6 @@
             <w:r>
               <w:rPr>
                 <w:rFonts w:eastAsiaTheme="minorEastAsia"/>
-                <w:b w:val="0"/>
-                <w:bCs w:val="0"/>
               </w:rPr>
               <w:tab/>
             </w:r>
@@ -344,7 +332,7 @@
               <w:rPr>
                 <w:webHidden/>
               </w:rPr>
-              <w:instrText xml:space="preserve"> PAGEREF _Toc198550507 \h </w:instrText>
+              <w:instrText xml:space="preserve"> PAGEREF _Toc198636605 \h </w:instrText>
             </w:r>
             <w:r>
               <w:rPr>
@@ -374,13 +362,12 @@
         <w:p>
           <w:pPr>
             <w:pStyle w:val="Sommario1"/>
+            <w:jc w:val="both"/>
             <w:rPr>
               <w:rFonts w:eastAsiaTheme="minorEastAsia"/>
-              <w:b w:val="0"/>
-              <w:bCs w:val="0"/>
             </w:rPr>
           </w:pPr>
-          <w:hyperlink w:anchor="_Toc198550508" w:history="1">
+          <w:hyperlink w:anchor="_Toc198636606" w:history="1">
             <w:r>
               <w:rPr>
                 <w:rStyle w:val="Collegamentoipertestuale"/>
@@ -391,8 +378,6 @@
             <w:r>
               <w:rPr>
                 <w:rFonts w:eastAsiaTheme="minorEastAsia"/>
-                <w:b w:val="0"/>
-                <w:bCs w:val="0"/>
               </w:rPr>
               <w:tab/>
             </w:r>
@@ -419,7 +404,7 @@
               <w:rPr>
                 <w:webHidden/>
               </w:rPr>
-              <w:instrText xml:space="preserve"> PAGEREF _Toc198550508 \h </w:instrText>
+              <w:instrText xml:space="preserve"> PAGEREF _Toc198636606 \h </w:instrText>
             </w:r>
             <w:r>
               <w:rPr>
@@ -449,13 +434,12 @@
         <w:p>
           <w:pPr>
             <w:pStyle w:val="Sommario1"/>
+            <w:jc w:val="both"/>
             <w:rPr>
               <w:rFonts w:eastAsiaTheme="minorEastAsia"/>
-              <w:b w:val="0"/>
-              <w:bCs w:val="0"/>
             </w:rPr>
           </w:pPr>
-          <w:hyperlink w:anchor="_Toc198550509" w:history="1">
+          <w:hyperlink w:anchor="_Toc198636607" w:history="1">
             <w:r>
               <w:rPr>
                 <w:rStyle w:val="Collegamentoipertestuale"/>
@@ -466,8 +450,6 @@
             <w:r>
               <w:rPr>
                 <w:rFonts w:eastAsiaTheme="minorEastAsia"/>
-                <w:b w:val="0"/>
-                <w:bCs w:val="0"/>
               </w:rPr>
               <w:tab/>
             </w:r>
@@ -494,7 +476,7 @@
               <w:rPr>
                 <w:webHidden/>
               </w:rPr>
-              <w:instrText xml:space="preserve"> PAGEREF _Toc198550509 \h </w:instrText>
+              <w:instrText xml:space="preserve"> PAGEREF _Toc198636607 \h </w:instrText>
             </w:r>
             <w:r>
               <w:rPr>
@@ -524,13 +506,12 @@
         <w:p>
           <w:pPr>
             <w:pStyle w:val="Sommario1"/>
+            <w:jc w:val="both"/>
             <w:rPr>
               <w:rFonts w:eastAsiaTheme="minorEastAsia"/>
-              <w:b w:val="0"/>
-              <w:bCs w:val="0"/>
             </w:rPr>
           </w:pPr>
-          <w:hyperlink w:anchor="_Toc198550510" w:history="1">
+          <w:hyperlink w:anchor="_Toc198636608" w:history="1">
             <w:r>
               <w:rPr>
                 <w:rStyle w:val="Collegamentoipertestuale"/>
@@ -541,8 +522,6 @@
             <w:r>
               <w:rPr>
                 <w:rFonts w:eastAsiaTheme="minorEastAsia"/>
-                <w:b w:val="0"/>
-                <w:bCs w:val="0"/>
               </w:rPr>
               <w:tab/>
             </w:r>
@@ -569,7 +548,7 @@
               <w:rPr>
                 <w:webHidden/>
               </w:rPr>
-              <w:instrText xml:space="preserve"> PAGEREF _Toc198550510 \h </w:instrText>
+              <w:instrText xml:space="preserve"> PAGEREF _Toc198636608 \h </w:instrText>
             </w:r>
             <w:r>
               <w:rPr>
@@ -599,13 +578,12 @@
         <w:p>
           <w:pPr>
             <w:pStyle w:val="Sommario1"/>
+            <w:jc w:val="both"/>
             <w:rPr>
               <w:rFonts w:eastAsiaTheme="minorEastAsia"/>
-              <w:b w:val="0"/>
-              <w:bCs w:val="0"/>
             </w:rPr>
           </w:pPr>
-          <w:hyperlink w:anchor="_Toc198550511" w:history="1">
+          <w:hyperlink w:anchor="_Toc198636609" w:history="1">
             <w:r>
               <w:rPr>
                 <w:rStyle w:val="Collegamentoipertestuale"/>
@@ -616,8 +594,6 @@
             <w:r>
               <w:rPr>
                 <w:rFonts w:eastAsiaTheme="minorEastAsia"/>
-                <w:b w:val="0"/>
-                <w:bCs w:val="0"/>
               </w:rPr>
               <w:tab/>
             </w:r>
@@ -644,7 +620,7 @@
               <w:rPr>
                 <w:webHidden/>
               </w:rPr>
-              <w:instrText xml:space="preserve"> PAGEREF _Toc198550511 \h </w:instrText>
+              <w:instrText xml:space="preserve"> PAGEREF _Toc198636609 \h </w:instrText>
             </w:r>
             <w:r>
               <w:rPr>
@@ -678,13 +654,14 @@
               <w:tab w:val="left" w:pos="960"/>
               <w:tab w:val="right" w:leader="underscore" w:pos="9628"/>
             </w:tabs>
+            <w:jc w:val="both"/>
             <w:rPr>
               <w:rFonts w:eastAsiaTheme="minorEastAsia"/>
               <w:noProof/>
               <w:lang w:eastAsia="it-IT"/>
             </w:rPr>
           </w:pPr>
-          <w:hyperlink w:anchor="_Toc198550512" w:history="1">
+          <w:hyperlink w:anchor="_Toc198636610" w:history="1">
             <w:r>
               <w:rPr>
                 <w:rStyle w:val="Collegamentoipertestuale"/>
@@ -731,7 +708,7 @@
                 <w:noProof/>
                 <w:webHidden/>
               </w:rPr>
-              <w:instrText xml:space="preserve"> PAGEREF _Toc198550512 \h </w:instrText>
+              <w:instrText xml:space="preserve"> PAGEREF _Toc198636610 \h </w:instrText>
             </w:r>
             <w:r>
               <w:rPr>
@@ -769,13 +746,14 @@
               <w:tab w:val="left" w:pos="960"/>
               <w:tab w:val="right" w:leader="underscore" w:pos="9628"/>
             </w:tabs>
+            <w:jc w:val="both"/>
             <w:rPr>
               <w:rFonts w:eastAsiaTheme="minorEastAsia"/>
               <w:noProof/>
               <w:lang w:eastAsia="it-IT"/>
             </w:rPr>
           </w:pPr>
-          <w:hyperlink w:anchor="_Toc198550513" w:history="1">
+          <w:hyperlink w:anchor="_Toc198636611" w:history="1">
             <w:r>
               <w:rPr>
                 <w:rStyle w:val="Collegamentoipertestuale"/>
@@ -822,7 +800,7 @@
                 <w:noProof/>
                 <w:webHidden/>
               </w:rPr>
-              <w:instrText xml:space="preserve"> PAGEREF _Toc198550513 \h </w:instrText>
+              <w:instrText xml:space="preserve"> PAGEREF _Toc198636611 \h </w:instrText>
             </w:r>
             <w:r>
               <w:rPr>
@@ -860,13 +838,14 @@
               <w:tab w:val="left" w:pos="960"/>
               <w:tab w:val="right" w:leader="underscore" w:pos="9628"/>
             </w:tabs>
+            <w:jc w:val="both"/>
             <w:rPr>
               <w:rFonts w:eastAsiaTheme="minorEastAsia"/>
               <w:noProof/>
               <w:lang w:eastAsia="it-IT"/>
             </w:rPr>
           </w:pPr>
-          <w:hyperlink w:anchor="_Toc198550514" w:history="1">
+          <w:hyperlink w:anchor="_Toc198636612" w:history="1">
             <w:r>
               <w:rPr>
                 <w:rStyle w:val="Collegamentoipertestuale"/>
@@ -913,7 +892,7 @@
                 <w:noProof/>
                 <w:webHidden/>
               </w:rPr>
-              <w:instrText xml:space="preserve"> PAGEREF _Toc198550514 \h </w:instrText>
+              <w:instrText xml:space="preserve"> PAGEREF _Toc198636612 \h </w:instrText>
             </w:r>
             <w:r>
               <w:rPr>
@@ -951,13 +930,14 @@
               <w:tab w:val="left" w:pos="960"/>
               <w:tab w:val="right" w:leader="underscore" w:pos="9628"/>
             </w:tabs>
+            <w:jc w:val="both"/>
             <w:rPr>
               <w:rFonts w:eastAsiaTheme="minorEastAsia"/>
               <w:noProof/>
               <w:lang w:eastAsia="it-IT"/>
             </w:rPr>
           </w:pPr>
-          <w:hyperlink w:anchor="_Toc198550515" w:history="1">
+          <w:hyperlink w:anchor="_Toc198636613" w:history="1">
             <w:r>
               <w:rPr>
                 <w:rStyle w:val="Collegamentoipertestuale"/>
@@ -1004,7 +984,7 @@
                 <w:noProof/>
                 <w:webHidden/>
               </w:rPr>
-              <w:instrText xml:space="preserve"> PAGEREF _Toc198550515 \h </w:instrText>
+              <w:instrText xml:space="preserve"> PAGEREF _Toc198636613 \h </w:instrText>
             </w:r>
             <w:r>
               <w:rPr>
@@ -1042,13 +1022,14 @@
               <w:tab w:val="left" w:pos="960"/>
               <w:tab w:val="right" w:leader="underscore" w:pos="9628"/>
             </w:tabs>
+            <w:jc w:val="both"/>
             <w:rPr>
               <w:rFonts w:eastAsiaTheme="minorEastAsia"/>
               <w:noProof/>
               <w:lang w:eastAsia="it-IT"/>
             </w:rPr>
           </w:pPr>
-          <w:hyperlink w:anchor="_Toc198550516" w:history="1">
+          <w:hyperlink w:anchor="_Toc198636614" w:history="1">
             <w:r>
               <w:rPr>
                 <w:rStyle w:val="Collegamentoipertestuale"/>
@@ -1095,7 +1076,7 @@
                 <w:noProof/>
                 <w:webHidden/>
               </w:rPr>
-              <w:instrText xml:space="preserve"> PAGEREF _Toc198550516 \h </w:instrText>
+              <w:instrText xml:space="preserve"> PAGEREF _Toc198636614 \h </w:instrText>
             </w:r>
             <w:r>
               <w:rPr>
@@ -1133,13 +1114,14 @@
               <w:tab w:val="left" w:pos="960"/>
               <w:tab w:val="right" w:leader="underscore" w:pos="9628"/>
             </w:tabs>
+            <w:jc w:val="both"/>
             <w:rPr>
               <w:rFonts w:eastAsiaTheme="minorEastAsia"/>
               <w:noProof/>
               <w:lang w:eastAsia="it-IT"/>
             </w:rPr>
           </w:pPr>
-          <w:hyperlink w:anchor="_Toc198550517" w:history="1">
+          <w:hyperlink w:anchor="_Toc198636615" w:history="1">
             <w:r>
               <w:rPr>
                 <w:rStyle w:val="Collegamentoipertestuale"/>
@@ -1186,7 +1168,7 @@
                 <w:noProof/>
                 <w:webHidden/>
               </w:rPr>
-              <w:instrText xml:space="preserve"> PAGEREF _Toc198550517 \h </w:instrText>
+              <w:instrText xml:space="preserve"> PAGEREF _Toc198636615 \h </w:instrText>
             </w:r>
             <w:r>
               <w:rPr>
@@ -1224,13 +1206,14 @@
               <w:tab w:val="left" w:pos="960"/>
               <w:tab w:val="right" w:leader="underscore" w:pos="9628"/>
             </w:tabs>
+            <w:jc w:val="both"/>
             <w:rPr>
               <w:rFonts w:eastAsiaTheme="minorEastAsia"/>
               <w:noProof/>
               <w:lang w:eastAsia="it-IT"/>
             </w:rPr>
           </w:pPr>
-          <w:hyperlink w:anchor="_Toc198550518" w:history="1">
+          <w:hyperlink w:anchor="_Toc198636616" w:history="1">
             <w:r>
               <w:rPr>
                 <w:rStyle w:val="Collegamentoipertestuale"/>
@@ -1277,7 +1260,7 @@
                 <w:noProof/>
                 <w:webHidden/>
               </w:rPr>
-              <w:instrText xml:space="preserve"> PAGEREF _Toc198550518 \h </w:instrText>
+              <w:instrText xml:space="preserve"> PAGEREF _Toc198636616 \h </w:instrText>
             </w:r>
             <w:r>
               <w:rPr>
@@ -1315,13 +1298,14 @@
               <w:tab w:val="left" w:pos="960"/>
               <w:tab w:val="right" w:leader="underscore" w:pos="9628"/>
             </w:tabs>
+            <w:jc w:val="both"/>
             <w:rPr>
               <w:rFonts w:eastAsiaTheme="minorEastAsia"/>
               <w:noProof/>
               <w:lang w:eastAsia="it-IT"/>
             </w:rPr>
           </w:pPr>
-          <w:hyperlink w:anchor="_Toc198550519" w:history="1">
+          <w:hyperlink w:anchor="_Toc198636617" w:history="1">
             <w:r>
               <w:rPr>
                 <w:rStyle w:val="Collegamentoipertestuale"/>
@@ -1368,7 +1352,7 @@
                 <w:noProof/>
                 <w:webHidden/>
               </w:rPr>
-              <w:instrText xml:space="preserve"> PAGEREF _Toc198550519 \h </w:instrText>
+              <w:instrText xml:space="preserve"> PAGEREF _Toc198636617 \h </w:instrText>
             </w:r>
             <w:r>
               <w:rPr>
@@ -1406,13 +1390,14 @@
               <w:tab w:val="left" w:pos="960"/>
               <w:tab w:val="right" w:leader="underscore" w:pos="9628"/>
             </w:tabs>
+            <w:jc w:val="both"/>
             <w:rPr>
               <w:rFonts w:eastAsiaTheme="minorEastAsia"/>
               <w:noProof/>
               <w:lang w:eastAsia="it-IT"/>
             </w:rPr>
           </w:pPr>
-          <w:hyperlink w:anchor="_Toc198550520" w:history="1">
+          <w:hyperlink w:anchor="_Toc198636618" w:history="1">
             <w:r>
               <w:rPr>
                 <w:rStyle w:val="Collegamentoipertestuale"/>
@@ -1459,7 +1444,7 @@
                 <w:noProof/>
                 <w:webHidden/>
               </w:rPr>
-              <w:instrText xml:space="preserve"> PAGEREF _Toc198550520 \h </w:instrText>
+              <w:instrText xml:space="preserve"> PAGEREF _Toc198636618 \h </w:instrText>
             </w:r>
             <w:r>
               <w:rPr>
@@ -1493,13 +1478,12 @@
         <w:p>
           <w:pPr>
             <w:pStyle w:val="Sommario1"/>
+            <w:jc w:val="both"/>
             <w:rPr>
               <w:rFonts w:eastAsiaTheme="minorEastAsia"/>
-              <w:b w:val="0"/>
-              <w:bCs w:val="0"/>
             </w:rPr>
           </w:pPr>
-          <w:hyperlink w:anchor="_Toc198550521" w:history="1">
+          <w:hyperlink w:anchor="_Toc198636619" w:history="1">
             <w:r>
               <w:rPr>
                 <w:rStyle w:val="Collegamentoipertestuale"/>
@@ -1510,8 +1494,6 @@
             <w:r>
               <w:rPr>
                 <w:rFonts w:eastAsiaTheme="minorEastAsia"/>
-                <w:b w:val="0"/>
-                <w:bCs w:val="0"/>
               </w:rPr>
               <w:tab/>
             </w:r>
@@ -1538,7 +1520,7 @@
               <w:rPr>
                 <w:webHidden/>
               </w:rPr>
-              <w:instrText xml:space="preserve"> PAGEREF _Toc198550521 \h </w:instrText>
+              <w:instrText xml:space="preserve"> PAGEREF _Toc198636619 \h </w:instrText>
             </w:r>
             <w:r>
               <w:rPr>
@@ -1568,13 +1550,12 @@
         <w:p>
           <w:pPr>
             <w:pStyle w:val="Sommario1"/>
+            <w:jc w:val="both"/>
             <w:rPr>
               <w:rFonts w:eastAsiaTheme="minorEastAsia"/>
-              <w:b w:val="0"/>
-              <w:bCs w:val="0"/>
             </w:rPr>
           </w:pPr>
-          <w:hyperlink w:anchor="_Toc198550522" w:history="1">
+          <w:hyperlink w:anchor="_Toc198636620" w:history="1">
             <w:r>
               <w:rPr>
                 <w:rStyle w:val="Collegamentoipertestuale"/>
@@ -1585,8 +1566,6 @@
             <w:r>
               <w:rPr>
                 <w:rFonts w:eastAsiaTheme="minorEastAsia"/>
-                <w:b w:val="0"/>
-                <w:bCs w:val="0"/>
               </w:rPr>
               <w:tab/>
             </w:r>
@@ -1613,7 +1592,7 @@
               <w:rPr>
                 <w:webHidden/>
               </w:rPr>
-              <w:instrText xml:space="preserve"> PAGEREF _Toc198550522 \h </w:instrText>
+              <w:instrText xml:space="preserve"> PAGEREF _Toc198636620 \h </w:instrText>
             </w:r>
             <w:r>
               <w:rPr>
@@ -1643,13 +1622,12 @@
         <w:p>
           <w:pPr>
             <w:pStyle w:val="Sommario1"/>
+            <w:jc w:val="both"/>
             <w:rPr>
               <w:rFonts w:eastAsiaTheme="minorEastAsia"/>
-              <w:b w:val="0"/>
-              <w:bCs w:val="0"/>
             </w:rPr>
           </w:pPr>
-          <w:hyperlink w:anchor="_Toc198550523" w:history="1">
+          <w:hyperlink w:anchor="_Toc198636621" w:history="1">
             <w:r>
               <w:rPr>
                 <w:rStyle w:val="Collegamentoipertestuale"/>
@@ -1660,8 +1638,6 @@
             <w:r>
               <w:rPr>
                 <w:rFonts w:eastAsiaTheme="minorEastAsia"/>
-                <w:b w:val="0"/>
-                <w:bCs w:val="0"/>
               </w:rPr>
               <w:tab/>
             </w:r>
@@ -1688,7 +1664,7 @@
               <w:rPr>
                 <w:webHidden/>
               </w:rPr>
-              <w:instrText xml:space="preserve"> PAGEREF _Toc198550523 \h </w:instrText>
+              <w:instrText xml:space="preserve"> PAGEREF _Toc198636621 \h </w:instrText>
             </w:r>
             <w:r>
               <w:rPr>
@@ -1738,26 +1714,6 @@
     </w:sdt>
     <w:p>
       <w:pPr>
-        <w:spacing w:line="360" w:lineRule="auto"/>
-        <w:jc w:val="both"/>
-        <w:rPr>
-          <w:rFonts w:ascii="Times New Roman" w:hAnsi="Times New Roman" w:cs="Times New Roman"/>
-          <w:lang w:eastAsia="it-IT"/>
-        </w:rPr>
-      </w:pPr>
-    </w:p>
-    <w:p>
-      <w:pPr>
-        <w:spacing w:line="360" w:lineRule="auto"/>
-        <w:jc w:val="both"/>
-        <w:rPr>
-          <w:rFonts w:ascii="Times New Roman" w:hAnsi="Times New Roman" w:cs="Times New Roman"/>
-          <w:lang w:eastAsia="it-IT"/>
-        </w:rPr>
-      </w:pPr>
-    </w:p>
-    <w:p>
-      <w:pPr>
         <w:pStyle w:val="Titolo1"/>
         <w:numPr>
           <w:ilvl w:val="0"/>
@@ -1775,7 +1731,7 @@
           <w:lang w:eastAsia="it-IT"/>
         </w:rPr>
       </w:pPr>
-      <w:bookmarkStart w:id="0" w:name="_Toc198550506"/>
+      <w:bookmarkStart w:id="0" w:name="_Toc198636604"/>
       <w:r>
         <w:rPr>
           <w:rFonts w:ascii="Times New Roman" w:eastAsia="Times New Roman" w:hAnsi="Times New Roman" w:cs="Times New Roman"/>
@@ -1786,6 +1742,7 @@
           <w:szCs w:val="36"/>
           <w:lang w:eastAsia="it-IT"/>
         </w:rPr>
+        <w:lastRenderedPageBreak/>
         <w:t>Intro</w:t>
       </w:r>
       <w:r>
@@ -2018,7 +1975,7 @@
           <w:lang w:eastAsia="it-IT"/>
         </w:rPr>
       </w:pPr>
-      <w:bookmarkStart w:id="1" w:name="_Toc198550507"/>
+      <w:bookmarkStart w:id="1" w:name="_Toc198636605"/>
       <w:r>
         <w:rPr>
           <w:rFonts w:ascii="Times New Roman" w:eastAsia="Times New Roman" w:hAnsi="Times New Roman" w:cs="Times New Roman"/>
@@ -2029,6 +1986,7 @@
           <w:szCs w:val="36"/>
           <w:lang w:eastAsia="it-IT"/>
         </w:rPr>
+        <w:lastRenderedPageBreak/>
         <w:t>Prerequisiti</w:t>
       </w:r>
       <w:bookmarkEnd w:id="1"/>
@@ -2056,24 +2014,20 @@
     </w:p>
     <w:p>
       <w:pPr>
-        <w:spacing w:line="360" w:lineRule="auto"/>
-        <w:jc w:val="both"/>
-        <w:rPr>
-          <w:rFonts w:ascii="Times New Roman" w:eastAsia="Times New Roman" w:hAnsi="Times New Roman" w:cs="Times New Roman"/>
-          <w:kern w:val="0"/>
-          <w:lang w:eastAsia="it-IT"/>
-          <w14:ligatures w14:val="none"/>
-        </w:rPr>
-      </w:pPr>
-      <w:r>
-        <w:rPr>
-          <w:rFonts w:ascii="Times New Roman" w:eastAsia="Times New Roman" w:hAnsi="Times New Roman" w:cs="Times New Roman"/>
-          <w:kern w:val="0"/>
-          <w:lang w:eastAsia="it-IT"/>
-          <w14:ligatures w14:val="none"/>
-        </w:rPr>
-        <w:t xml:space="preserve"> </w:t>
-      </w:r>
+        <w:pStyle w:val="Paragrafoelenco"/>
+        <w:numPr>
+          <w:ilvl w:val="0"/>
+          <w:numId w:val="59"/>
+        </w:numPr>
+        <w:spacing w:line="360" w:lineRule="auto"/>
+        <w:jc w:val="both"/>
+        <w:rPr>
+          <w:rFonts w:ascii="Times New Roman" w:eastAsia="Times New Roman" w:hAnsi="Times New Roman" w:cs="Times New Roman"/>
+          <w:kern w:val="0"/>
+          <w:lang w:eastAsia="it-IT"/>
+          <w14:ligatures w14:val="none"/>
+        </w:rPr>
+      </w:pPr>
       <w:r>
         <w:rPr>
           <w:rFonts w:ascii="Times New Roman" w:eastAsia="Times New Roman" w:hAnsi="Times New Roman" w:cs="Times New Roman"/>
@@ -2117,24 +2071,20 @@
     </w:p>
     <w:p>
       <w:pPr>
-        <w:spacing w:line="360" w:lineRule="auto"/>
-        <w:jc w:val="both"/>
-        <w:rPr>
-          <w:rFonts w:ascii="Times New Roman" w:eastAsia="Times New Roman" w:hAnsi="Times New Roman" w:cs="Times New Roman"/>
-          <w:kern w:val="0"/>
-          <w:lang w:eastAsia="it-IT"/>
-          <w14:ligatures w14:val="none"/>
-        </w:rPr>
-      </w:pPr>
-      <w:r>
-        <w:rPr>
-          <w:rFonts w:ascii="Times New Roman" w:eastAsia="Times New Roman" w:hAnsi="Times New Roman" w:cs="Times New Roman"/>
-          <w:kern w:val="0"/>
-          <w:lang w:eastAsia="it-IT"/>
-          <w14:ligatures w14:val="none"/>
-        </w:rPr>
-        <w:t xml:space="preserve"> </w:t>
-      </w:r>
+        <w:pStyle w:val="Paragrafoelenco"/>
+        <w:numPr>
+          <w:ilvl w:val="0"/>
+          <w:numId w:val="59"/>
+        </w:numPr>
+        <w:spacing w:line="360" w:lineRule="auto"/>
+        <w:jc w:val="both"/>
+        <w:rPr>
+          <w:rFonts w:ascii="Times New Roman" w:eastAsia="Times New Roman" w:hAnsi="Times New Roman" w:cs="Times New Roman"/>
+          <w:kern w:val="0"/>
+          <w:lang w:eastAsia="it-IT"/>
+          <w14:ligatures w14:val="none"/>
+        </w:rPr>
+      </w:pPr>
       <w:r>
         <w:rPr>
           <w:rFonts w:ascii="Times New Roman" w:eastAsia="Times New Roman" w:hAnsi="Times New Roman" w:cs="Times New Roman"/>
@@ -2178,24 +2128,20 @@
     </w:p>
     <w:p>
       <w:pPr>
-        <w:spacing w:line="360" w:lineRule="auto"/>
-        <w:jc w:val="both"/>
-        <w:rPr>
-          <w:rFonts w:ascii="Times New Roman" w:eastAsia="Times New Roman" w:hAnsi="Times New Roman" w:cs="Times New Roman"/>
-          <w:kern w:val="0"/>
-          <w:lang w:eastAsia="it-IT"/>
-          <w14:ligatures w14:val="none"/>
-        </w:rPr>
-      </w:pPr>
-      <w:r>
-        <w:rPr>
-          <w:rFonts w:ascii="Times New Roman" w:eastAsia="Times New Roman" w:hAnsi="Times New Roman" w:cs="Times New Roman"/>
-          <w:kern w:val="0"/>
-          <w:lang w:eastAsia="it-IT"/>
-          <w14:ligatures w14:val="none"/>
-        </w:rPr>
-        <w:t xml:space="preserve"> </w:t>
-      </w:r>
+        <w:pStyle w:val="Paragrafoelenco"/>
+        <w:numPr>
+          <w:ilvl w:val="0"/>
+          <w:numId w:val="59"/>
+        </w:numPr>
+        <w:spacing w:line="360" w:lineRule="auto"/>
+        <w:jc w:val="both"/>
+        <w:rPr>
+          <w:rFonts w:ascii="Times New Roman" w:eastAsia="Times New Roman" w:hAnsi="Times New Roman" w:cs="Times New Roman"/>
+          <w:kern w:val="0"/>
+          <w:lang w:eastAsia="it-IT"/>
+          <w14:ligatures w14:val="none"/>
+        </w:rPr>
+      </w:pPr>
       <w:proofErr w:type="spellStart"/>
       <w:r>
         <w:rPr>
@@ -2221,6 +2167,11 @@
     </w:p>
     <w:p>
       <w:pPr>
+        <w:pStyle w:val="Paragrafoelenco"/>
+        <w:numPr>
+          <w:ilvl w:val="0"/>
+          <w:numId w:val="59"/>
+        </w:numPr>
         <w:spacing w:before="100" w:beforeAutospacing="1" w:after="100" w:afterAutospacing="1" w:line="360" w:lineRule="auto"/>
         <w:jc w:val="both"/>
         <w:rPr>
@@ -2230,15 +2181,6 @@
           <w14:ligatures w14:val="none"/>
         </w:rPr>
       </w:pPr>
-      <w:r>
-        <w:rPr>
-          <w:rFonts w:ascii="Times New Roman" w:eastAsia="Times New Roman" w:hAnsi="Times New Roman" w:cs="Times New Roman"/>
-          <w:kern w:val="0"/>
-          <w:lang w:eastAsia="it-IT"/>
-          <w14:ligatures w14:val="none"/>
-        </w:rPr>
-        <w:t xml:space="preserve"> </w:t>
-      </w:r>
       <w:proofErr w:type="spellStart"/>
       <w:r>
         <w:rPr>
@@ -2264,6 +2206,11 @@
     </w:p>
     <w:p>
       <w:pPr>
+        <w:pStyle w:val="Paragrafoelenco"/>
+        <w:numPr>
+          <w:ilvl w:val="0"/>
+          <w:numId w:val="59"/>
+        </w:numPr>
         <w:spacing w:before="100" w:beforeAutospacing="1" w:after="100" w:afterAutospacing="1" w:line="360" w:lineRule="auto"/>
         <w:jc w:val="both"/>
         <w:rPr>
@@ -2273,15 +2220,6 @@
       <w:r>
         <w:rPr>
           <w:rFonts w:ascii="Times New Roman" w:eastAsia="Times New Roman" w:hAnsi="Times New Roman" w:cs="Times New Roman"/>
-          <w:kern w:val="0"/>
-          <w:lang w:eastAsia="it-IT"/>
-          <w14:ligatures w14:val="none"/>
-        </w:rPr>
-        <w:t xml:space="preserve"> </w:t>
-      </w:r>
-      <w:r>
-        <w:rPr>
-          <w:rFonts w:ascii="Times New Roman" w:eastAsia="Times New Roman" w:hAnsi="Times New Roman" w:cs="Times New Roman"/>
           <w:b/>
           <w:bCs/>
           <w:kern w:val="0"/>
@@ -2307,6 +2245,11 @@
     </w:p>
     <w:p>
       <w:pPr>
+        <w:pStyle w:val="Paragrafoelenco"/>
+        <w:numPr>
+          <w:ilvl w:val="0"/>
+          <w:numId w:val="59"/>
+        </w:numPr>
         <w:spacing w:before="100" w:beforeAutospacing="1" w:after="100" w:afterAutospacing="1" w:line="360" w:lineRule="auto"/>
         <w:jc w:val="both"/>
         <w:rPr>
@@ -2380,7 +2323,7 @@
           <w:lang w:eastAsia="it-IT"/>
         </w:rPr>
       </w:pPr>
-      <w:bookmarkStart w:id="2" w:name="_Toc198550508"/>
+      <w:bookmarkStart w:id="2" w:name="_Toc198636606"/>
       <w:r>
         <w:rPr>
           <w:rFonts w:ascii="Times New Roman" w:eastAsia="Times New Roman" w:hAnsi="Times New Roman" w:cs="Times New Roman"/>
@@ -2604,7 +2547,6 @@
         <w:jc w:val="both"/>
       </w:pPr>
       <w:r>
-        <w:lastRenderedPageBreak/>
         <w:t xml:space="preserve">Esegui la classe </w:t>
       </w:r>
       <w:r>
@@ -2635,7 +2577,7 @@
           <w:lang w:eastAsia="it-IT"/>
         </w:rPr>
       </w:pPr>
-      <w:bookmarkStart w:id="3" w:name="_Toc198550509"/>
+      <w:bookmarkStart w:id="3" w:name="_Toc198636607"/>
       <w:r>
         <w:rPr>
           <w:rFonts w:ascii="Times New Roman" w:eastAsia="Times New Roman" w:hAnsi="Times New Roman" w:cs="Times New Roman"/>
@@ -2644,6 +2586,7 @@
           <w:color w:val="auto"/>
           <w:lang w:eastAsia="it-IT"/>
         </w:rPr>
+        <w:lastRenderedPageBreak/>
         <w:t>Interfaccia Server</w:t>
       </w:r>
       <w:bookmarkEnd w:id="3"/>
@@ -3123,7 +3066,6 @@
           <w:lang w:eastAsia="it-IT"/>
           <w14:ligatures w14:val="none"/>
         </w:rPr>
-        <w:lastRenderedPageBreak/>
         <w:t>Carica i dati iniziali (se è il primo avvio)</w:t>
       </w:r>
     </w:p>
@@ -3187,6 +3129,7 @@
           <w:lang w:eastAsia="it-IT"/>
           <w14:ligatures w14:val="none"/>
         </w:rPr>
+        <w:lastRenderedPageBreak/>
         <w:t xml:space="preserve">Avvia il </w:t>
       </w:r>
       <w:proofErr w:type="spellStart"/>
@@ -3603,7 +3546,6 @@
         <w:jc w:val="both"/>
       </w:pPr>
       <w:r>
-        <w:lastRenderedPageBreak/>
         <w:t>I dati vengano salvati</w:t>
       </w:r>
     </w:p>
@@ -3646,7 +3588,7 @@
           <w:lang w:eastAsia="it-IT"/>
         </w:rPr>
       </w:pPr>
-      <w:bookmarkStart w:id="4" w:name="_Toc198550510"/>
+      <w:bookmarkStart w:id="4" w:name="_Toc198636608"/>
       <w:r>
         <w:rPr>
           <w:rFonts w:ascii="Times New Roman" w:eastAsia="Times New Roman" w:hAnsi="Times New Roman" w:cs="Times New Roman"/>
@@ -3655,6 +3597,7 @@
           <w:color w:val="auto"/>
           <w:lang w:eastAsia="it-IT"/>
         </w:rPr>
+        <w:lastRenderedPageBreak/>
         <w:t>Interfaccia</w:t>
       </w:r>
       <w:r>
@@ -4232,7 +4175,7 @@
           <w:lang w:eastAsia="it-IT"/>
         </w:rPr>
       </w:pPr>
-      <w:bookmarkStart w:id="5" w:name="_Toc198550511"/>
+      <w:bookmarkStart w:id="5" w:name="_Toc198636609"/>
       <w:r>
         <w:rPr>
           <w:rFonts w:ascii="Times New Roman" w:eastAsia="Times New Roman" w:hAnsi="Times New Roman" w:cs="Times New Roman"/>
@@ -4265,7 +4208,7 @@
           <w:szCs w:val="32"/>
         </w:rPr>
       </w:pPr>
-      <w:bookmarkStart w:id="6" w:name="_Toc198550512"/>
+      <w:bookmarkStart w:id="6" w:name="_Toc198636610"/>
       <w:r>
         <w:rPr>
           <w:rFonts w:ascii="Times New Roman" w:hAnsi="Times New Roman" w:cs="Times New Roman"/>
@@ -4300,7 +4243,7 @@
           <w:noProof/>
         </w:rPr>
         <w:drawing>
-          <wp:inline distT="0" distB="0" distL="0" distR="0" wp14:anchorId="771AC3A9" wp14:editId="697FB2FE">
+          <wp:inline distT="0" distB="0" distL="0" distR="0" wp14:anchorId="771AC3A9" wp14:editId="2576CB71">
             <wp:extent cx="3156576" cy="3310180"/>
             <wp:effectExtent l="88900" t="88900" r="95250" b="93980"/>
             <wp:docPr id="1170170386" name="Immagine 9" descr="Immagine che contiene testo, schermata, software, Pagina Web&#10;&#10;Il contenuto generato dall'IA potrebbe non essere corretto."/>
@@ -4788,7 +4731,7 @@
           <w:szCs w:val="32"/>
         </w:rPr>
       </w:pPr>
-      <w:bookmarkStart w:id="7" w:name="_Toc198550513"/>
+      <w:bookmarkStart w:id="7" w:name="_Toc198636611"/>
       <w:r>
         <w:rPr>
           <w:rFonts w:ascii="Times New Roman" w:hAnsi="Times New Roman" w:cs="Times New Roman"/>
@@ -5584,7 +5527,11 @@
         </w:rPr>
       </w:pPr>
     </w:p>
-    <w:p/>
+    <w:p>
+      <w:pPr>
+        <w:jc w:val="both"/>
+      </w:pPr>
+    </w:p>
     <w:p>
       <w:pPr>
         <w:pStyle w:val="Titolo3"/>
@@ -5603,7 +5550,7 @@
           <w:szCs w:val="32"/>
         </w:rPr>
       </w:pPr>
-      <w:bookmarkStart w:id="8" w:name="_Toc198550514"/>
+      <w:bookmarkStart w:id="8" w:name="_Toc198636612"/>
       <w:r>
         <w:rPr>
           <w:rFonts w:ascii="Times New Roman" w:hAnsi="Times New Roman" w:cs="Times New Roman"/>
@@ -6031,7 +5978,7 @@
           <w:szCs w:val="32"/>
         </w:rPr>
       </w:pPr>
-      <w:bookmarkStart w:id="9" w:name="_Toc198550515"/>
+      <w:bookmarkStart w:id="9" w:name="_Toc198636613"/>
       <w:r>
         <w:rPr>
           <w:rFonts w:ascii="Times New Roman" w:hAnsi="Times New Roman" w:cs="Times New Roman"/>
@@ -6403,7 +6350,7 @@
           <w:szCs w:val="32"/>
         </w:rPr>
       </w:pPr>
-      <w:bookmarkStart w:id="10" w:name="_Toc198550516"/>
+      <w:bookmarkStart w:id="10" w:name="_Toc198636614"/>
       <w:r>
         <w:rPr>
           <w:rFonts w:ascii="Times New Roman" w:hAnsi="Times New Roman" w:cs="Times New Roman"/>
@@ -6849,7 +6796,7 @@
           <w:szCs w:val="32"/>
         </w:rPr>
       </w:pPr>
-      <w:bookmarkStart w:id="11" w:name="_Toc198550517"/>
+      <w:bookmarkStart w:id="11" w:name="_Toc198636615"/>
       <w:r>
         <w:rPr>
           <w:rFonts w:ascii="Times New Roman" w:hAnsi="Times New Roman" w:cs="Times New Roman"/>
@@ -6888,7 +6835,7 @@
     <w:p>
       <w:pPr>
         <w:spacing w:before="100" w:beforeAutospacing="1" w:after="100" w:afterAutospacing="1" w:line="360" w:lineRule="auto"/>
-        <w:ind w:firstLine="993"/>
+        <w:ind w:firstLine="709"/>
         <w:jc w:val="both"/>
         <w:rPr>
           <w:rFonts w:ascii="Times New Roman" w:eastAsia="Times New Roman" w:hAnsi="Times New Roman" w:cs="Times New Roman"/>
@@ -6906,9 +6853,9 @@
           <w14:ligatures w14:val="none"/>
         </w:rPr>
         <w:drawing>
-          <wp:inline distT="0" distB="0" distL="0" distR="0" wp14:anchorId="6485F0B7" wp14:editId="6521B4AC">
-            <wp:extent cx="4534858" cy="2773501"/>
-            <wp:effectExtent l="88900" t="88900" r="88265" b="84455"/>
+          <wp:inline distT="0" distB="0" distL="0" distR="0" wp14:anchorId="6485F0B7" wp14:editId="62B9717A">
+            <wp:extent cx="4537422" cy="2775070"/>
+            <wp:effectExtent l="88900" t="88900" r="85725" b="82550"/>
             <wp:docPr id="756543738" name="Immagine 6"/>
             <wp:cNvGraphicFramePr>
               <a:graphicFrameLocks xmlns:a="http://schemas.openxmlformats.org/drawingml/2006/main" noChangeAspect="1"/>
@@ -6936,7 +6883,7 @@
                   <pic:spPr bwMode="auto">
                     <a:xfrm>
                       <a:off x="0" y="0"/>
-                      <a:ext cx="4551543" cy="2783706"/>
+                      <a:ext cx="4582735" cy="2802784"/>
                     </a:xfrm>
                     <a:prstGeom prst="rect">
                       <a:avLst/>
@@ -7174,7 +7121,7 @@
           <w:szCs w:val="32"/>
         </w:rPr>
       </w:pPr>
-      <w:bookmarkStart w:id="12" w:name="_Toc198550518"/>
+      <w:bookmarkStart w:id="12" w:name="_Toc198636616"/>
       <w:r>
         <w:rPr>
           <w:rFonts w:ascii="Times New Roman" w:hAnsi="Times New Roman" w:cs="Times New Roman"/>
@@ -7959,7 +7906,7 @@
           <w:szCs w:val="32"/>
         </w:rPr>
       </w:pPr>
-      <w:bookmarkStart w:id="13" w:name="_Toc198550519"/>
+      <w:bookmarkStart w:id="13" w:name="_Toc198636617"/>
       <w:r>
         <w:rPr>
           <w:rFonts w:ascii="Times New Roman" w:hAnsi="Times New Roman" w:cs="Times New Roman"/>
@@ -8486,7 +8433,7 @@
           <w:szCs w:val="32"/>
         </w:rPr>
       </w:pPr>
-      <w:bookmarkStart w:id="14" w:name="_Toc198550520"/>
+      <w:bookmarkStart w:id="14" w:name="_Toc198636618"/>
       <w:r>
         <w:rPr>
           <w:rFonts w:ascii="Times New Roman" w:hAnsi="Times New Roman" w:cs="Times New Roman"/>
@@ -8525,19 +8472,7 @@
     <w:p>
       <w:pPr>
         <w:spacing w:before="100" w:beforeAutospacing="1" w:after="100" w:afterAutospacing="1" w:line="360" w:lineRule="auto"/>
-        <w:jc w:val="both"/>
-        <w:rPr>
-          <w:rFonts w:ascii="Times New Roman" w:eastAsia="Times New Roman" w:hAnsi="Times New Roman" w:cs="Times New Roman"/>
-          <w:kern w:val="0"/>
-          <w:lang w:eastAsia="it-IT"/>
-          <w14:ligatures w14:val="none"/>
-        </w:rPr>
-      </w:pPr>
-    </w:p>
-    <w:p>
-      <w:pPr>
-        <w:spacing w:before="100" w:beforeAutospacing="1" w:after="100" w:afterAutospacing="1" w:line="360" w:lineRule="auto"/>
-        <w:ind w:firstLine="1701"/>
+        <w:ind w:firstLine="993"/>
         <w:jc w:val="both"/>
         <w:rPr>
           <w:rFonts w:ascii="Times New Roman" w:eastAsia="Times New Roman" w:hAnsi="Times New Roman" w:cs="Times New Roman"/>
@@ -8554,9 +8489,9 @@
           <w:lang w:eastAsia="it-IT"/>
         </w:rPr>
         <w:drawing>
-          <wp:inline distT="0" distB="0" distL="0" distR="0" wp14:anchorId="6363EC4A" wp14:editId="7B51B4A0">
-            <wp:extent cx="3539203" cy="2976632"/>
-            <wp:effectExtent l="88900" t="88900" r="93345" b="84455"/>
+          <wp:inline distT="0" distB="0" distL="0" distR="0" wp14:anchorId="6363EC4A" wp14:editId="282861D1">
+            <wp:extent cx="4017274" cy="3378711"/>
+            <wp:effectExtent l="88900" t="88900" r="85090" b="88900"/>
             <wp:docPr id="467544006" name="Immagine 9" descr="Immagine che contiene testo, schermata, software, Icona del computer&#10;&#10;Descrizione generata automaticamente"/>
             <wp:cNvGraphicFramePr>
               <a:graphicFrameLocks xmlns:a="http://schemas.openxmlformats.org/drawingml/2006/main" noChangeAspect="1"/>
@@ -8583,7 +8518,7 @@
                   <pic:spPr>
                     <a:xfrm>
                       <a:off x="0" y="0"/>
-                      <a:ext cx="3594711" cy="3023317"/>
+                      <a:ext cx="4094287" cy="3443483"/>
                     </a:xfrm>
                     <a:prstGeom prst="rect">
                       <a:avLst/>
@@ -8935,7 +8870,7 @@
           <w:lang w:eastAsia="it-IT"/>
         </w:rPr>
       </w:pPr>
-      <w:bookmarkStart w:id="15" w:name="_Toc198550521"/>
+      <w:bookmarkStart w:id="15" w:name="_Toc198636619"/>
       <w:r>
         <w:rPr>
           <w:rFonts w:ascii="Times New Roman" w:eastAsia="Times New Roman" w:hAnsi="Times New Roman" w:cs="Times New Roman"/>
@@ -8961,6 +8896,7 @@
     </w:p>
     <w:p>
       <w:pPr>
+        <w:jc w:val="both"/>
         <w:rPr>
           <w:rFonts w:ascii="Times New Roman" w:hAnsi="Times New Roman" w:cs="Times New Roman"/>
           <w:lang w:eastAsia="it-IT"/>
@@ -9093,7 +9029,7 @@
     <w:p>
       <w:pPr>
         <w:spacing w:line="360" w:lineRule="auto"/>
-        <w:ind w:left="360" w:firstLine="1200"/>
+        <w:ind w:left="360" w:firstLine="1058"/>
         <w:jc w:val="both"/>
         <w:rPr>
           <w:rFonts w:ascii="Times New Roman" w:hAnsi="Times New Roman" w:cs="Times New Roman"/>
@@ -9171,126 +9107,142 @@
     </w:p>
     <w:p>
       <w:pPr>
-        <w:rPr>
-          <w:rFonts w:ascii="Times New Roman" w:hAnsi="Times New Roman" w:cs="Times New Roman"/>
-          <w:lang w:eastAsia="it-IT"/>
-        </w:rPr>
-      </w:pPr>
-    </w:p>
-    <w:p>
-      <w:pPr>
-        <w:rPr>
-          <w:rFonts w:ascii="Times New Roman" w:hAnsi="Times New Roman" w:cs="Times New Roman"/>
-          <w:lang w:eastAsia="it-IT"/>
-        </w:rPr>
-      </w:pPr>
-    </w:p>
-    <w:p>
-      <w:pPr>
-        <w:rPr>
-          <w:rFonts w:ascii="Times New Roman" w:hAnsi="Times New Roman" w:cs="Times New Roman"/>
-          <w:lang w:eastAsia="it-IT"/>
-        </w:rPr>
-      </w:pPr>
-    </w:p>
-    <w:p>
-      <w:pPr>
-        <w:rPr>
-          <w:rFonts w:ascii="Times New Roman" w:hAnsi="Times New Roman" w:cs="Times New Roman"/>
-          <w:lang w:eastAsia="it-IT"/>
-        </w:rPr>
-      </w:pPr>
-    </w:p>
-    <w:p>
-      <w:pPr>
-        <w:rPr>
-          <w:rFonts w:ascii="Times New Roman" w:hAnsi="Times New Roman" w:cs="Times New Roman"/>
-          <w:lang w:eastAsia="it-IT"/>
-        </w:rPr>
-      </w:pPr>
-    </w:p>
-    <w:p>
-      <w:pPr>
-        <w:rPr>
-          <w:rFonts w:ascii="Times New Roman" w:hAnsi="Times New Roman" w:cs="Times New Roman"/>
-          <w:lang w:eastAsia="it-IT"/>
-        </w:rPr>
-      </w:pPr>
-    </w:p>
-    <w:p>
-      <w:pPr>
-        <w:rPr>
-          <w:rFonts w:ascii="Times New Roman" w:hAnsi="Times New Roman" w:cs="Times New Roman"/>
-          <w:lang w:eastAsia="it-IT"/>
-        </w:rPr>
-      </w:pPr>
-    </w:p>
-    <w:p>
-      <w:pPr>
-        <w:rPr>
-          <w:rFonts w:ascii="Times New Roman" w:hAnsi="Times New Roman" w:cs="Times New Roman"/>
-          <w:lang w:eastAsia="it-IT"/>
-        </w:rPr>
-      </w:pPr>
-    </w:p>
-    <w:p>
-      <w:pPr>
-        <w:rPr>
-          <w:rFonts w:ascii="Times New Roman" w:hAnsi="Times New Roman" w:cs="Times New Roman"/>
-          <w:lang w:eastAsia="it-IT"/>
-        </w:rPr>
-      </w:pPr>
-    </w:p>
-    <w:p>
-      <w:pPr>
-        <w:rPr>
-          <w:rFonts w:ascii="Times New Roman" w:hAnsi="Times New Roman" w:cs="Times New Roman"/>
-          <w:lang w:eastAsia="it-IT"/>
-        </w:rPr>
-      </w:pPr>
-    </w:p>
-    <w:p>
-      <w:pPr>
-        <w:rPr>
-          <w:rFonts w:ascii="Times New Roman" w:hAnsi="Times New Roman" w:cs="Times New Roman"/>
-          <w:lang w:eastAsia="it-IT"/>
-        </w:rPr>
-      </w:pPr>
-    </w:p>
-    <w:p>
-      <w:pPr>
-        <w:rPr>
-          <w:rFonts w:ascii="Times New Roman" w:hAnsi="Times New Roman" w:cs="Times New Roman"/>
-          <w:lang w:eastAsia="it-IT"/>
-        </w:rPr>
-      </w:pPr>
-    </w:p>
-    <w:p>
-      <w:pPr>
-        <w:rPr>
-          <w:rFonts w:ascii="Times New Roman" w:hAnsi="Times New Roman" w:cs="Times New Roman"/>
-          <w:lang w:eastAsia="it-IT"/>
-        </w:rPr>
-      </w:pPr>
-    </w:p>
-    <w:p>
-      <w:pPr>
-        <w:rPr>
-          <w:rFonts w:ascii="Times New Roman" w:hAnsi="Times New Roman" w:cs="Times New Roman"/>
-          <w:lang w:eastAsia="it-IT"/>
-        </w:rPr>
-      </w:pPr>
-    </w:p>
-    <w:p>
-      <w:pPr>
-        <w:rPr>
-          <w:rFonts w:ascii="Times New Roman" w:hAnsi="Times New Roman" w:cs="Times New Roman"/>
-          <w:lang w:eastAsia="it-IT"/>
-        </w:rPr>
-      </w:pPr>
-    </w:p>
-    <w:p>
-      <w:pPr>
+        <w:jc w:val="both"/>
+        <w:rPr>
+          <w:rFonts w:ascii="Times New Roman" w:hAnsi="Times New Roman" w:cs="Times New Roman"/>
+          <w:lang w:eastAsia="it-IT"/>
+        </w:rPr>
+      </w:pPr>
+    </w:p>
+    <w:p>
+      <w:pPr>
+        <w:jc w:val="both"/>
+        <w:rPr>
+          <w:rFonts w:ascii="Times New Roman" w:hAnsi="Times New Roman" w:cs="Times New Roman"/>
+          <w:lang w:eastAsia="it-IT"/>
+        </w:rPr>
+      </w:pPr>
+    </w:p>
+    <w:p>
+      <w:pPr>
+        <w:jc w:val="both"/>
+        <w:rPr>
+          <w:rFonts w:ascii="Times New Roman" w:hAnsi="Times New Roman" w:cs="Times New Roman"/>
+          <w:lang w:eastAsia="it-IT"/>
+        </w:rPr>
+      </w:pPr>
+    </w:p>
+    <w:p>
+      <w:pPr>
+        <w:jc w:val="both"/>
+        <w:rPr>
+          <w:rFonts w:ascii="Times New Roman" w:hAnsi="Times New Roman" w:cs="Times New Roman"/>
+          <w:lang w:eastAsia="it-IT"/>
+        </w:rPr>
+      </w:pPr>
+    </w:p>
+    <w:p>
+      <w:pPr>
+        <w:jc w:val="both"/>
+        <w:rPr>
+          <w:rFonts w:ascii="Times New Roman" w:hAnsi="Times New Roman" w:cs="Times New Roman"/>
+          <w:lang w:eastAsia="it-IT"/>
+        </w:rPr>
+      </w:pPr>
+    </w:p>
+    <w:p>
+      <w:pPr>
+        <w:jc w:val="both"/>
+        <w:rPr>
+          <w:rFonts w:ascii="Times New Roman" w:hAnsi="Times New Roman" w:cs="Times New Roman"/>
+          <w:lang w:eastAsia="it-IT"/>
+        </w:rPr>
+      </w:pPr>
+    </w:p>
+    <w:p>
+      <w:pPr>
+        <w:jc w:val="both"/>
+        <w:rPr>
+          <w:rFonts w:ascii="Times New Roman" w:hAnsi="Times New Roman" w:cs="Times New Roman"/>
+          <w:lang w:eastAsia="it-IT"/>
+        </w:rPr>
+      </w:pPr>
+    </w:p>
+    <w:p>
+      <w:pPr>
+        <w:jc w:val="both"/>
+        <w:rPr>
+          <w:rFonts w:ascii="Times New Roman" w:hAnsi="Times New Roman" w:cs="Times New Roman"/>
+          <w:lang w:eastAsia="it-IT"/>
+        </w:rPr>
+      </w:pPr>
+    </w:p>
+    <w:p>
+      <w:pPr>
+        <w:jc w:val="both"/>
+        <w:rPr>
+          <w:rFonts w:ascii="Times New Roman" w:hAnsi="Times New Roman" w:cs="Times New Roman"/>
+          <w:lang w:eastAsia="it-IT"/>
+        </w:rPr>
+      </w:pPr>
+    </w:p>
+    <w:p>
+      <w:pPr>
+        <w:jc w:val="both"/>
+        <w:rPr>
+          <w:rFonts w:ascii="Times New Roman" w:hAnsi="Times New Roman" w:cs="Times New Roman"/>
+          <w:lang w:eastAsia="it-IT"/>
+        </w:rPr>
+      </w:pPr>
+    </w:p>
+    <w:p>
+      <w:pPr>
+        <w:jc w:val="both"/>
+        <w:rPr>
+          <w:rFonts w:ascii="Times New Roman" w:hAnsi="Times New Roman" w:cs="Times New Roman"/>
+          <w:lang w:eastAsia="it-IT"/>
+        </w:rPr>
+      </w:pPr>
+    </w:p>
+    <w:p>
+      <w:pPr>
+        <w:jc w:val="both"/>
+        <w:rPr>
+          <w:rFonts w:ascii="Times New Roman" w:hAnsi="Times New Roman" w:cs="Times New Roman"/>
+          <w:lang w:eastAsia="it-IT"/>
+        </w:rPr>
+      </w:pPr>
+    </w:p>
+    <w:p>
+      <w:pPr>
+        <w:jc w:val="both"/>
+        <w:rPr>
+          <w:rFonts w:ascii="Times New Roman" w:hAnsi="Times New Roman" w:cs="Times New Roman"/>
+          <w:lang w:eastAsia="it-IT"/>
+        </w:rPr>
+      </w:pPr>
+    </w:p>
+    <w:p>
+      <w:pPr>
+        <w:jc w:val="both"/>
+        <w:rPr>
+          <w:rFonts w:ascii="Times New Roman" w:hAnsi="Times New Roman" w:cs="Times New Roman"/>
+          <w:lang w:eastAsia="it-IT"/>
+        </w:rPr>
+      </w:pPr>
+    </w:p>
+    <w:p>
+      <w:pPr>
+        <w:jc w:val="both"/>
+        <w:rPr>
+          <w:rFonts w:ascii="Times New Roman" w:hAnsi="Times New Roman" w:cs="Times New Roman"/>
+          <w:lang w:eastAsia="it-IT"/>
+        </w:rPr>
+      </w:pPr>
+    </w:p>
+    <w:p>
+      <w:pPr>
+        <w:jc w:val="both"/>
         <w:rPr>
           <w:rFonts w:ascii="Times New Roman" w:hAnsi="Times New Roman" w:cs="Times New Roman"/>
           <w:lang w:eastAsia="it-IT"/>
@@ -9378,7 +9330,7 @@
     <w:p>
       <w:pPr>
         <w:spacing w:line="360" w:lineRule="auto"/>
-        <w:ind w:right="2267" w:firstLine="1276"/>
+        <w:ind w:right="2267" w:firstLine="1418"/>
         <w:jc w:val="both"/>
         <w:rPr>
           <w:rFonts w:ascii="Times New Roman" w:hAnsi="Times New Roman" w:cs="Times New Roman"/>
@@ -12375,9 +12327,9 @@
           <w:noProof/>
         </w:rPr>
         <w:drawing>
-          <wp:inline distT="0" distB="0" distL="0" distR="0" wp14:anchorId="0B95DE92" wp14:editId="395019AA">
-            <wp:extent cx="3396096" cy="1877792"/>
-            <wp:effectExtent l="88900" t="88900" r="83820" b="90805"/>
+          <wp:inline distT="0" distB="0" distL="0" distR="0" wp14:anchorId="0B95DE92" wp14:editId="35C1890F">
+            <wp:extent cx="3677157" cy="2033198"/>
+            <wp:effectExtent l="88900" t="88900" r="82550" b="88265"/>
             <wp:docPr id="1927468295" name="Immagine 18" descr="Immagine che contiene testo, schermata, Carattere&#10;&#10;Il contenuto generato dall'IA potrebbe non essere corretto."/>
             <wp:cNvGraphicFramePr>
               <a:graphicFrameLocks xmlns:a="http://schemas.openxmlformats.org/drawingml/2006/main" noChangeAspect="1"/>
@@ -12407,7 +12359,7 @@
                   <pic:spPr bwMode="auto">
                     <a:xfrm>
                       <a:off x="0" y="0"/>
-                      <a:ext cx="3436442" cy="1900100"/>
+                      <a:ext cx="3733549" cy="2064379"/>
                     </a:xfrm>
                     <a:prstGeom prst="rect">
                       <a:avLst/>
@@ -13168,7 +13120,7 @@
           <w:lang w:eastAsia="it-IT"/>
         </w:rPr>
       </w:pPr>
-      <w:bookmarkStart w:id="16" w:name="_Toc198550522"/>
+      <w:bookmarkStart w:id="16" w:name="_Toc198636620"/>
       <w:r>
         <w:rPr>
           <w:rFonts w:ascii="Times New Roman" w:eastAsia="Times New Roman" w:hAnsi="Times New Roman" w:cs="Times New Roman"/>
@@ -13234,7 +13186,7 @@
           <w:lang w:eastAsia="it-IT"/>
         </w:rPr>
       </w:pPr>
-      <w:bookmarkStart w:id="17" w:name="_Toc198550523"/>
+      <w:bookmarkStart w:id="17" w:name="_Toc198636621"/>
       <w:r>
         <w:rPr>
           <w:rFonts w:ascii="Times New Roman" w:eastAsia="Times New Roman" w:hAnsi="Times New Roman" w:cs="Times New Roman"/>
@@ -13249,6 +13201,7 @@
     </w:p>
     <w:p>
       <w:pPr>
+        <w:jc w:val="both"/>
         <w:rPr>
           <w:lang w:eastAsia="it-IT"/>
         </w:rPr>
@@ -13684,7 +13637,7 @@
                 </wp:anchor>
               </w:drawing>
             </mc:Choice>
-            <mc:Fallback>
+            <mc:Fallback xmlns="">
               <w:pict>
                 <v:oval w14:anchorId="02BE1FDB" id="Ovale 2" o:spid="_x0000_s1026" style="position:absolute;margin-left:0;margin-top:0;width:44.25pt;height:44.25pt;rotation:180;flip:x;z-index:251659264;visibility:visible;mso-wrap-style:square;mso-width-percent:0;mso-height-percent:0;mso-wrap-distance-left:9pt;mso-wrap-distance-top:0;mso-wrap-distance-right:9pt;mso-wrap-distance-bottom:0;mso-position-horizontal:center;mso-position-horizontal-relative:right-margin-area;mso-position-vertical:center;mso-position-vertical-relative:bottom-margin-area;mso-width-percent:0;mso-height-percent:0;mso-width-relative:page;mso-height-relative:bottom-margin-area;v-text-anchor:middle" o:gfxdata="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" filled="f" fillcolor="#c0504d" strokecolor="#adc1d9" strokeweight="1pt">
                   <v:textbox inset=",0,,0">
@@ -15066,6 +15019,119 @@
     </w:lvl>
   </w:abstractNum>
   <w:abstractNum w:abstractNumId="10" w15:restartNumberingAfterBreak="0">
+    <w:nsid w:val="1FB510B2"/>
+    <w:multiLevelType w:val="hybridMultilevel"/>
+    <w:tmpl w:val="539C01B6"/>
+    <w:lvl w:ilvl="0" w:tplc="04100003">
+      <w:start w:val="1"/>
+      <w:numFmt w:val="bullet"/>
+      <w:lvlText w:val="o"/>
+      <w:lvlJc w:val="left"/>
+      <w:pPr>
+        <w:ind w:left="720" w:hanging="360"/>
+      </w:pPr>
+      <w:rPr>
+        <w:rFonts w:ascii="Courier New" w:hAnsi="Courier New" w:cs="Courier New" w:hint="default"/>
+      </w:rPr>
+    </w:lvl>
+    <w:lvl w:ilvl="1" w:tplc="04100003" w:tentative="1">
+      <w:start w:val="1"/>
+      <w:numFmt w:val="bullet"/>
+      <w:lvlText w:val="o"/>
+      <w:lvlJc w:val="left"/>
+      <w:pPr>
+        <w:ind w:left="1440" w:hanging="360"/>
+      </w:pPr>
+      <w:rPr>
+        <w:rFonts w:ascii="Courier New" w:hAnsi="Courier New" w:cs="Courier New" w:hint="default"/>
+      </w:rPr>
+    </w:lvl>
+    <w:lvl w:ilvl="2" w:tplc="04100005" w:tentative="1">
+      <w:start w:val="1"/>
+      <w:numFmt w:val="bullet"/>
+      <w:lvlText w:val=""/>
+      <w:lvlJc w:val="left"/>
+      <w:pPr>
+        <w:ind w:left="2160" w:hanging="360"/>
+      </w:pPr>
+      <w:rPr>
+        <w:rFonts w:ascii="Wingdings" w:hAnsi="Wingdings" w:hint="default"/>
+      </w:rPr>
+    </w:lvl>
+    <w:lvl w:ilvl="3" w:tplc="04100001" w:tentative="1">
+      <w:start w:val="1"/>
+      <w:numFmt w:val="bullet"/>
+      <w:lvlText w:val=""/>
+      <w:lvlJc w:val="left"/>
+      <w:pPr>
+        <w:ind w:left="2880" w:hanging="360"/>
+      </w:pPr>
+      <w:rPr>
+        <w:rFonts w:ascii="Symbol" w:hAnsi="Symbol" w:hint="default"/>
+      </w:rPr>
+    </w:lvl>
+    <w:lvl w:ilvl="4" w:tplc="04100003" w:tentative="1">
+      <w:start w:val="1"/>
+      <w:numFmt w:val="bullet"/>
+      <w:lvlText w:val="o"/>
+      <w:lvlJc w:val="left"/>
+      <w:pPr>
+        <w:ind w:left="3600" w:hanging="360"/>
+      </w:pPr>
+      <w:rPr>
+        <w:rFonts w:ascii="Courier New" w:hAnsi="Courier New" w:cs="Courier New" w:hint="default"/>
+      </w:rPr>
+    </w:lvl>
+    <w:lvl w:ilvl="5" w:tplc="04100005" w:tentative="1">
+      <w:start w:val="1"/>
+      <w:numFmt w:val="bullet"/>
+      <w:lvlText w:val=""/>
+      <w:lvlJc w:val="left"/>
+      <w:pPr>
+        <w:ind w:left="4320" w:hanging="360"/>
+      </w:pPr>
+      <w:rPr>
+        <w:rFonts w:ascii="Wingdings" w:hAnsi="Wingdings" w:hint="default"/>
+      </w:rPr>
+    </w:lvl>
+    <w:lvl w:ilvl="6" w:tplc="04100001" w:tentative="1">
+      <w:start w:val="1"/>
+      <w:numFmt w:val="bullet"/>
+      <w:lvlText w:val=""/>
+      <w:lvlJc w:val="left"/>
+      <w:pPr>
+        <w:ind w:left="5040" w:hanging="360"/>
+      </w:pPr>
+      <w:rPr>
+        <w:rFonts w:ascii="Symbol" w:hAnsi="Symbol" w:hint="default"/>
+      </w:rPr>
+    </w:lvl>
+    <w:lvl w:ilvl="7" w:tplc="04100003" w:tentative="1">
+      <w:start w:val="1"/>
+      <w:numFmt w:val="bullet"/>
+      <w:lvlText w:val="o"/>
+      <w:lvlJc w:val="left"/>
+      <w:pPr>
+        <w:ind w:left="5760" w:hanging="360"/>
+      </w:pPr>
+      <w:rPr>
+        <w:rFonts w:ascii="Courier New" w:hAnsi="Courier New" w:cs="Courier New" w:hint="default"/>
+      </w:rPr>
+    </w:lvl>
+    <w:lvl w:ilvl="8" w:tplc="04100005" w:tentative="1">
+      <w:start w:val="1"/>
+      <w:numFmt w:val="bullet"/>
+      <w:lvlText w:val=""/>
+      <w:lvlJc w:val="left"/>
+      <w:pPr>
+        <w:ind w:left="6480" w:hanging="360"/>
+      </w:pPr>
+      <w:rPr>
+        <w:rFonts w:ascii="Wingdings" w:hAnsi="Wingdings" w:hint="default"/>
+      </w:rPr>
+    </w:lvl>
+  </w:abstractNum>
+  <w:abstractNum w:abstractNumId="11" w15:restartNumberingAfterBreak="0">
     <w:nsid w:val="1FEA08ED"/>
     <w:multiLevelType w:val="multilevel"/>
     <w:tmpl w:val="252EB68C"/>
@@ -15178,7 +15244,7 @@
       </w:pPr>
     </w:lvl>
   </w:abstractNum>
-  <w:abstractNum w:abstractNumId="11" w15:restartNumberingAfterBreak="0">
+  <w:abstractNum w:abstractNumId="12" w15:restartNumberingAfterBreak="0">
     <w:nsid w:val="22AB44F8"/>
     <w:multiLevelType w:val="multilevel"/>
     <w:tmpl w:val="1EE8EA00"/>
@@ -15291,7 +15357,7 @@
       </w:pPr>
     </w:lvl>
   </w:abstractNum>
-  <w:abstractNum w:abstractNumId="12" w15:restartNumberingAfterBreak="0">
+  <w:abstractNum w:abstractNumId="13" w15:restartNumberingAfterBreak="0">
     <w:nsid w:val="24E21F39"/>
     <w:multiLevelType w:val="multilevel"/>
     <w:tmpl w:val="F37EC9D2"/>
@@ -15440,7 +15506,7 @@
       </w:rPr>
     </w:lvl>
   </w:abstractNum>
-  <w:abstractNum w:abstractNumId="13" w15:restartNumberingAfterBreak="0">
+  <w:abstractNum w:abstractNumId="14" w15:restartNumberingAfterBreak="0">
     <w:nsid w:val="27DE2E18"/>
     <w:multiLevelType w:val="hybridMultilevel"/>
     <w:tmpl w:val="01A2FD48"/>
@@ -15553,7 +15619,7 @@
       </w:rPr>
     </w:lvl>
   </w:abstractNum>
-  <w:abstractNum w:abstractNumId="14" w15:restartNumberingAfterBreak="0">
+  <w:abstractNum w:abstractNumId="15" w15:restartNumberingAfterBreak="0">
     <w:nsid w:val="2DF24C9B"/>
     <w:multiLevelType w:val="multilevel"/>
     <w:tmpl w:val="308A6D64"/>
@@ -15674,7 +15740,7 @@
       </w:pPr>
     </w:lvl>
   </w:abstractNum>
-  <w:abstractNum w:abstractNumId="15" w15:restartNumberingAfterBreak="0">
+  <w:abstractNum w:abstractNumId="16" w15:restartNumberingAfterBreak="0">
     <w:nsid w:val="2FFC0E77"/>
     <w:multiLevelType w:val="hybridMultilevel"/>
     <w:tmpl w:val="178A832A"/>
@@ -15787,7 +15853,7 @@
       </w:rPr>
     </w:lvl>
   </w:abstractNum>
-  <w:abstractNum w:abstractNumId="16" w15:restartNumberingAfterBreak="0">
+  <w:abstractNum w:abstractNumId="17" w15:restartNumberingAfterBreak="0">
     <w:nsid w:val="30D46487"/>
     <w:multiLevelType w:val="multilevel"/>
     <w:tmpl w:val="AE58F7D6"/>
@@ -15936,7 +16002,7 @@
       </w:rPr>
     </w:lvl>
   </w:abstractNum>
-  <w:abstractNum w:abstractNumId="17" w15:restartNumberingAfterBreak="0">
+  <w:abstractNum w:abstractNumId="18" w15:restartNumberingAfterBreak="0">
     <w:nsid w:val="314C7766"/>
     <w:multiLevelType w:val="multilevel"/>
     <w:tmpl w:val="8C52B30C"/>
@@ -16049,7 +16115,7 @@
       </w:pPr>
     </w:lvl>
   </w:abstractNum>
-  <w:abstractNum w:abstractNumId="18" w15:restartNumberingAfterBreak="0">
+  <w:abstractNum w:abstractNumId="19" w15:restartNumberingAfterBreak="0">
     <w:nsid w:val="319A13CC"/>
     <w:multiLevelType w:val="multilevel"/>
     <w:tmpl w:val="66F0987A"/>
@@ -16166,7 +16232,7 @@
       </w:pPr>
     </w:lvl>
   </w:abstractNum>
-  <w:abstractNum w:abstractNumId="19" w15:restartNumberingAfterBreak="0">
+  <w:abstractNum w:abstractNumId="20" w15:restartNumberingAfterBreak="0">
     <w:nsid w:val="331D2343"/>
     <w:multiLevelType w:val="hybridMultilevel"/>
     <w:tmpl w:val="044E8A5A"/>
@@ -16279,7 +16345,7 @@
       </w:rPr>
     </w:lvl>
   </w:abstractNum>
-  <w:abstractNum w:abstractNumId="20" w15:restartNumberingAfterBreak="0">
+  <w:abstractNum w:abstractNumId="21" w15:restartNumberingAfterBreak="0">
     <w:nsid w:val="37C54515"/>
     <w:multiLevelType w:val="hybridMultilevel"/>
     <w:tmpl w:val="0CCA0B56"/>
@@ -16392,7 +16458,7 @@
       </w:rPr>
     </w:lvl>
   </w:abstractNum>
-  <w:abstractNum w:abstractNumId="21" w15:restartNumberingAfterBreak="0">
+  <w:abstractNum w:abstractNumId="22" w15:restartNumberingAfterBreak="0">
     <w:nsid w:val="383741E5"/>
     <w:multiLevelType w:val="multilevel"/>
     <w:tmpl w:val="49466922"/>
@@ -16509,7 +16575,7 @@
       </w:pPr>
     </w:lvl>
   </w:abstractNum>
-  <w:abstractNum w:abstractNumId="22" w15:restartNumberingAfterBreak="0">
+  <w:abstractNum w:abstractNumId="23" w15:restartNumberingAfterBreak="0">
     <w:nsid w:val="39DC73D8"/>
     <w:multiLevelType w:val="hybridMultilevel"/>
     <w:tmpl w:val="BE068174"/>
@@ -16622,7 +16688,7 @@
       </w:rPr>
     </w:lvl>
   </w:abstractNum>
-  <w:abstractNum w:abstractNumId="23" w15:restartNumberingAfterBreak="0">
+  <w:abstractNum w:abstractNumId="24" w15:restartNumberingAfterBreak="0">
     <w:nsid w:val="3B4470E7"/>
     <w:multiLevelType w:val="hybridMultilevel"/>
     <w:tmpl w:val="54DCD22C"/>
@@ -16735,7 +16801,7 @@
       </w:rPr>
     </w:lvl>
   </w:abstractNum>
-  <w:abstractNum w:abstractNumId="24" w15:restartNumberingAfterBreak="0">
+  <w:abstractNum w:abstractNumId="25" w15:restartNumberingAfterBreak="0">
     <w:nsid w:val="3BF020F9"/>
     <w:multiLevelType w:val="multilevel"/>
     <w:tmpl w:val="BC9E6D78"/>
@@ -16884,7 +16950,7 @@
       </w:rPr>
     </w:lvl>
   </w:abstractNum>
-  <w:abstractNum w:abstractNumId="25" w15:restartNumberingAfterBreak="0">
+  <w:abstractNum w:abstractNumId="26" w15:restartNumberingAfterBreak="0">
     <w:nsid w:val="3CD45D95"/>
     <w:multiLevelType w:val="multilevel"/>
     <w:tmpl w:val="308A6D64"/>
@@ -17005,7 +17071,7 @@
       </w:pPr>
     </w:lvl>
   </w:abstractNum>
-  <w:abstractNum w:abstractNumId="26" w15:restartNumberingAfterBreak="0">
+  <w:abstractNum w:abstractNumId="27" w15:restartNumberingAfterBreak="0">
     <w:nsid w:val="3CDB6A7C"/>
     <w:multiLevelType w:val="multilevel"/>
     <w:tmpl w:val="C43846DA"/>
@@ -17154,7 +17220,7 @@
       </w:rPr>
     </w:lvl>
   </w:abstractNum>
-  <w:abstractNum w:abstractNumId="27" w15:restartNumberingAfterBreak="0">
+  <w:abstractNum w:abstractNumId="28" w15:restartNumberingAfterBreak="0">
     <w:nsid w:val="3F2C3789"/>
     <w:multiLevelType w:val="multilevel"/>
     <w:tmpl w:val="9B1AA098"/>
@@ -17303,7 +17369,7 @@
       </w:rPr>
     </w:lvl>
   </w:abstractNum>
-  <w:abstractNum w:abstractNumId="28" w15:restartNumberingAfterBreak="0">
+  <w:abstractNum w:abstractNumId="29" w15:restartNumberingAfterBreak="0">
     <w:nsid w:val="44315146"/>
     <w:multiLevelType w:val="multilevel"/>
     <w:tmpl w:val="845A02B2"/>
@@ -17416,7 +17482,7 @@
       </w:pPr>
     </w:lvl>
   </w:abstractNum>
-  <w:abstractNum w:abstractNumId="29" w15:restartNumberingAfterBreak="0">
+  <w:abstractNum w:abstractNumId="30" w15:restartNumberingAfterBreak="0">
     <w:nsid w:val="44912CA6"/>
     <w:multiLevelType w:val="hybridMultilevel"/>
     <w:tmpl w:val="2E26EB72"/>
@@ -17505,7 +17571,7 @@
       </w:pPr>
     </w:lvl>
   </w:abstractNum>
-  <w:abstractNum w:abstractNumId="30" w15:restartNumberingAfterBreak="0">
+  <w:abstractNum w:abstractNumId="31" w15:restartNumberingAfterBreak="0">
     <w:nsid w:val="45342EB3"/>
     <w:multiLevelType w:val="hybridMultilevel"/>
     <w:tmpl w:val="C5E45002"/>
@@ -17618,7 +17684,7 @@
       </w:rPr>
     </w:lvl>
   </w:abstractNum>
-  <w:abstractNum w:abstractNumId="31" w15:restartNumberingAfterBreak="0">
+  <w:abstractNum w:abstractNumId="32" w15:restartNumberingAfterBreak="0">
     <w:nsid w:val="47955A1F"/>
     <w:multiLevelType w:val="multilevel"/>
     <w:tmpl w:val="4ED4B1C6"/>
@@ -17767,7 +17833,7 @@
       </w:rPr>
     </w:lvl>
   </w:abstractNum>
-  <w:abstractNum w:abstractNumId="32" w15:restartNumberingAfterBreak="0">
+  <w:abstractNum w:abstractNumId="33" w15:restartNumberingAfterBreak="0">
     <w:nsid w:val="47A07E4B"/>
     <w:multiLevelType w:val="multilevel"/>
     <w:tmpl w:val="C074A2DC"/>
@@ -17916,7 +17982,7 @@
       </w:rPr>
     </w:lvl>
   </w:abstractNum>
-  <w:abstractNum w:abstractNumId="33" w15:restartNumberingAfterBreak="0">
+  <w:abstractNum w:abstractNumId="34" w15:restartNumberingAfterBreak="0">
     <w:nsid w:val="47D743FD"/>
     <w:multiLevelType w:val="multilevel"/>
     <w:tmpl w:val="CE621A04"/>
@@ -18065,7 +18131,7 @@
       </w:rPr>
     </w:lvl>
   </w:abstractNum>
-  <w:abstractNum w:abstractNumId="34" w15:restartNumberingAfterBreak="0">
+  <w:abstractNum w:abstractNumId="35" w15:restartNumberingAfterBreak="0">
     <w:nsid w:val="4B640B05"/>
     <w:multiLevelType w:val="multilevel"/>
     <w:tmpl w:val="FF52A5BE"/>
@@ -18214,7 +18280,7 @@
       </w:rPr>
     </w:lvl>
   </w:abstractNum>
-  <w:abstractNum w:abstractNumId="35" w15:restartNumberingAfterBreak="0">
+  <w:abstractNum w:abstractNumId="36" w15:restartNumberingAfterBreak="0">
     <w:nsid w:val="4CC61147"/>
     <w:multiLevelType w:val="multilevel"/>
     <w:tmpl w:val="2182D148"/>
@@ -18331,7 +18397,7 @@
       </w:pPr>
     </w:lvl>
   </w:abstractNum>
-  <w:abstractNum w:abstractNumId="36" w15:restartNumberingAfterBreak="0">
+  <w:abstractNum w:abstractNumId="37" w15:restartNumberingAfterBreak="0">
     <w:nsid w:val="4E2B1A28"/>
     <w:multiLevelType w:val="multilevel"/>
     <w:tmpl w:val="28C6948C"/>
@@ -18480,7 +18546,7 @@
       </w:rPr>
     </w:lvl>
   </w:abstractNum>
-  <w:abstractNum w:abstractNumId="37" w15:restartNumberingAfterBreak="0">
+  <w:abstractNum w:abstractNumId="38" w15:restartNumberingAfterBreak="0">
     <w:nsid w:val="537C0686"/>
     <w:multiLevelType w:val="hybridMultilevel"/>
     <w:tmpl w:val="327E77D0"/>
@@ -18593,7 +18659,7 @@
       </w:rPr>
     </w:lvl>
   </w:abstractNum>
-  <w:abstractNum w:abstractNumId="38" w15:restartNumberingAfterBreak="0">
+  <w:abstractNum w:abstractNumId="39" w15:restartNumberingAfterBreak="0">
     <w:nsid w:val="556003CF"/>
     <w:multiLevelType w:val="multilevel"/>
     <w:tmpl w:val="04C4353A"/>
@@ -18735,7 +18801,7 @@
       </w:rPr>
     </w:lvl>
   </w:abstractNum>
-  <w:abstractNum w:abstractNumId="39" w15:restartNumberingAfterBreak="0">
+  <w:abstractNum w:abstractNumId="40" w15:restartNumberingAfterBreak="0">
     <w:nsid w:val="56C87689"/>
     <w:multiLevelType w:val="hybridMultilevel"/>
     <w:tmpl w:val="521C7E82"/>
@@ -18848,7 +18914,7 @@
       </w:rPr>
     </w:lvl>
   </w:abstractNum>
-  <w:abstractNum w:abstractNumId="40" w15:restartNumberingAfterBreak="0">
+  <w:abstractNum w:abstractNumId="41" w15:restartNumberingAfterBreak="0">
     <w:nsid w:val="5DE42BDF"/>
     <w:multiLevelType w:val="hybridMultilevel"/>
     <w:tmpl w:val="42B43E44"/>
@@ -18937,7 +19003,7 @@
       </w:pPr>
     </w:lvl>
   </w:abstractNum>
-  <w:abstractNum w:abstractNumId="41" w15:restartNumberingAfterBreak="0">
+  <w:abstractNum w:abstractNumId="42" w15:restartNumberingAfterBreak="0">
     <w:nsid w:val="5F3C3DA5"/>
     <w:multiLevelType w:val="hybridMultilevel"/>
     <w:tmpl w:val="0F0CB454"/>
@@ -19029,7 +19095,7 @@
       </w:pPr>
     </w:lvl>
   </w:abstractNum>
-  <w:abstractNum w:abstractNumId="42" w15:restartNumberingAfterBreak="0">
+  <w:abstractNum w:abstractNumId="43" w15:restartNumberingAfterBreak="0">
     <w:nsid w:val="60FC7BEB"/>
     <w:multiLevelType w:val="hybridMultilevel"/>
     <w:tmpl w:val="1218A318"/>
@@ -19142,7 +19208,7 @@
       </w:rPr>
     </w:lvl>
   </w:abstractNum>
-  <w:abstractNum w:abstractNumId="43" w15:restartNumberingAfterBreak="0">
+  <w:abstractNum w:abstractNumId="44" w15:restartNumberingAfterBreak="0">
     <w:nsid w:val="61D9062C"/>
     <w:multiLevelType w:val="multilevel"/>
     <w:tmpl w:val="FAB22380"/>
@@ -19291,7 +19357,7 @@
       </w:rPr>
     </w:lvl>
   </w:abstractNum>
-  <w:abstractNum w:abstractNumId="44" w15:restartNumberingAfterBreak="0">
+  <w:abstractNum w:abstractNumId="45" w15:restartNumberingAfterBreak="0">
     <w:nsid w:val="657D2767"/>
     <w:multiLevelType w:val="multilevel"/>
     <w:tmpl w:val="9146D66A"/>
@@ -19408,7 +19474,7 @@
       </w:pPr>
     </w:lvl>
   </w:abstractNum>
-  <w:abstractNum w:abstractNumId="45" w15:restartNumberingAfterBreak="0">
+  <w:abstractNum w:abstractNumId="46" w15:restartNumberingAfterBreak="0">
     <w:nsid w:val="676B2F26"/>
     <w:multiLevelType w:val="multilevel"/>
     <w:tmpl w:val="1CDA4B24"/>
@@ -19557,7 +19623,7 @@
       </w:rPr>
     </w:lvl>
   </w:abstractNum>
-  <w:abstractNum w:abstractNumId="46" w15:restartNumberingAfterBreak="0">
+  <w:abstractNum w:abstractNumId="47" w15:restartNumberingAfterBreak="0">
     <w:nsid w:val="67FF70EB"/>
     <w:multiLevelType w:val="multilevel"/>
     <w:tmpl w:val="77A0A48E"/>
@@ -19706,7 +19772,7 @@
       </w:rPr>
     </w:lvl>
   </w:abstractNum>
-  <w:abstractNum w:abstractNumId="47" w15:restartNumberingAfterBreak="0">
+  <w:abstractNum w:abstractNumId="48" w15:restartNumberingAfterBreak="0">
     <w:nsid w:val="68420B97"/>
     <w:multiLevelType w:val="multilevel"/>
     <w:tmpl w:val="BF00E964"/>
@@ -19855,7 +19921,7 @@
       </w:rPr>
     </w:lvl>
   </w:abstractNum>
-  <w:abstractNum w:abstractNumId="48" w15:restartNumberingAfterBreak="0">
+  <w:abstractNum w:abstractNumId="49" w15:restartNumberingAfterBreak="0">
     <w:nsid w:val="697B5113"/>
     <w:multiLevelType w:val="multilevel"/>
     <w:tmpl w:val="012A0208"/>
@@ -20004,7 +20070,7 @@
       </w:rPr>
     </w:lvl>
   </w:abstractNum>
-  <w:abstractNum w:abstractNumId="49" w15:restartNumberingAfterBreak="0">
+  <w:abstractNum w:abstractNumId="50" w15:restartNumberingAfterBreak="0">
     <w:nsid w:val="6FA731CA"/>
     <w:multiLevelType w:val="hybridMultilevel"/>
     <w:tmpl w:val="B726B74A"/>
@@ -20117,7 +20183,7 @@
       </w:rPr>
     </w:lvl>
   </w:abstractNum>
-  <w:abstractNum w:abstractNumId="50" w15:restartNumberingAfterBreak="0">
+  <w:abstractNum w:abstractNumId="51" w15:restartNumberingAfterBreak="0">
     <w:nsid w:val="720171EB"/>
     <w:multiLevelType w:val="hybridMultilevel"/>
     <w:tmpl w:val="245E8F52"/>
@@ -20207,7 +20273,7 @@
       </w:pPr>
     </w:lvl>
   </w:abstractNum>
-  <w:abstractNum w:abstractNumId="51" w15:restartNumberingAfterBreak="0">
+  <w:abstractNum w:abstractNumId="52" w15:restartNumberingAfterBreak="0">
     <w:nsid w:val="72573443"/>
     <w:multiLevelType w:val="multilevel"/>
     <w:tmpl w:val="3C30788A"/>
@@ -20356,7 +20422,7 @@
       </w:rPr>
     </w:lvl>
   </w:abstractNum>
-  <w:abstractNum w:abstractNumId="52" w15:restartNumberingAfterBreak="0">
+  <w:abstractNum w:abstractNumId="53" w15:restartNumberingAfterBreak="0">
     <w:nsid w:val="72BA0A76"/>
     <w:multiLevelType w:val="multilevel"/>
     <w:tmpl w:val="188E611A"/>
@@ -20505,7 +20571,7 @@
       </w:rPr>
     </w:lvl>
   </w:abstractNum>
-  <w:abstractNum w:abstractNumId="53" w15:restartNumberingAfterBreak="0">
+  <w:abstractNum w:abstractNumId="54" w15:restartNumberingAfterBreak="0">
     <w:nsid w:val="75743584"/>
     <w:multiLevelType w:val="hybridMultilevel"/>
     <w:tmpl w:val="75CE058E"/>
@@ -20594,7 +20660,7 @@
       </w:pPr>
     </w:lvl>
   </w:abstractNum>
-  <w:abstractNum w:abstractNumId="54" w15:restartNumberingAfterBreak="0">
+  <w:abstractNum w:abstractNumId="55" w15:restartNumberingAfterBreak="0">
     <w:nsid w:val="783978B0"/>
     <w:multiLevelType w:val="multilevel"/>
     <w:tmpl w:val="8DA0C2AE"/>
@@ -20707,7 +20773,7 @@
       </w:pPr>
     </w:lvl>
   </w:abstractNum>
-  <w:abstractNum w:abstractNumId="55" w15:restartNumberingAfterBreak="0">
+  <w:abstractNum w:abstractNumId="56" w15:restartNumberingAfterBreak="0">
     <w:nsid w:val="789952E4"/>
     <w:multiLevelType w:val="multilevel"/>
     <w:tmpl w:val="8E525A2A"/>
@@ -20856,7 +20922,7 @@
       </w:rPr>
     </w:lvl>
   </w:abstractNum>
-  <w:abstractNum w:abstractNumId="56" w15:restartNumberingAfterBreak="0">
+  <w:abstractNum w:abstractNumId="57" w15:restartNumberingAfterBreak="0">
     <w:nsid w:val="7A114121"/>
     <w:multiLevelType w:val="multilevel"/>
     <w:tmpl w:val="9A1EE1CC"/>
@@ -21005,7 +21071,7 @@
       </w:rPr>
     </w:lvl>
   </w:abstractNum>
-  <w:abstractNum w:abstractNumId="57" w15:restartNumberingAfterBreak="0">
+  <w:abstractNum w:abstractNumId="58" w15:restartNumberingAfterBreak="0">
     <w:nsid w:val="7BAE263D"/>
     <w:multiLevelType w:val="multilevel"/>
     <w:tmpl w:val="7C7C1954"/>
@@ -21122,22 +21188,22 @@
     <w:abstractNumId w:val="1"/>
   </w:num>
   <w:num w:numId="2" w16cid:durableId="1860850323">
-    <w:abstractNumId w:val="38"/>
+    <w:abstractNumId w:val="39"/>
   </w:num>
   <w:num w:numId="3" w16cid:durableId="1340809541">
     <w:abstractNumId w:val="9"/>
   </w:num>
   <w:num w:numId="4" w16cid:durableId="1755929166">
-    <w:abstractNumId w:val="56"/>
+    <w:abstractNumId w:val="57"/>
   </w:num>
   <w:num w:numId="5" w16cid:durableId="739670919">
-    <w:abstractNumId w:val="17"/>
+    <w:abstractNumId w:val="18"/>
   </w:num>
   <w:num w:numId="6" w16cid:durableId="1284581837">
-    <w:abstractNumId w:val="31"/>
+    <w:abstractNumId w:val="32"/>
   </w:num>
   <w:num w:numId="7" w16cid:durableId="506752868">
-    <w:abstractNumId w:val="45"/>
+    <w:abstractNumId w:val="46"/>
   </w:num>
   <w:num w:numId="8" w16cid:durableId="329331422">
     <w:abstractNumId w:val="7"/>
@@ -21149,136 +21215,136 @@
     <w:abstractNumId w:val="4"/>
   </w:num>
   <w:num w:numId="11" w16cid:durableId="1065764155">
-    <w:abstractNumId w:val="11"/>
+    <w:abstractNumId w:val="12"/>
   </w:num>
   <w:num w:numId="12" w16cid:durableId="2038003755">
-    <w:abstractNumId w:val="18"/>
+    <w:abstractNumId w:val="19"/>
   </w:num>
   <w:num w:numId="13" w16cid:durableId="822083675">
+    <w:abstractNumId w:val="36"/>
+  </w:num>
+  <w:num w:numId="14" w16cid:durableId="186524402">
     <w:abstractNumId w:val="35"/>
   </w:num>
-  <w:num w:numId="14" w16cid:durableId="186524402">
-    <w:abstractNumId w:val="34"/>
-  </w:num>
   <w:num w:numId="15" w16cid:durableId="944386796">
-    <w:abstractNumId w:val="43"/>
+    <w:abstractNumId w:val="44"/>
   </w:num>
   <w:num w:numId="16" w16cid:durableId="981421482">
-    <w:abstractNumId w:val="30"/>
+    <w:abstractNumId w:val="31"/>
   </w:num>
   <w:num w:numId="17" w16cid:durableId="5595165">
-    <w:abstractNumId w:val="22"/>
+    <w:abstractNumId w:val="23"/>
   </w:num>
   <w:num w:numId="18" w16cid:durableId="1717310674">
-    <w:abstractNumId w:val="49"/>
+    <w:abstractNumId w:val="50"/>
   </w:num>
   <w:num w:numId="19" w16cid:durableId="1768381363">
-    <w:abstractNumId w:val="15"/>
+    <w:abstractNumId w:val="16"/>
   </w:num>
   <w:num w:numId="20" w16cid:durableId="23557299">
-    <w:abstractNumId w:val="53"/>
+    <w:abstractNumId w:val="54"/>
   </w:num>
   <w:num w:numId="21" w16cid:durableId="1557814881">
-    <w:abstractNumId w:val="50"/>
+    <w:abstractNumId w:val="51"/>
   </w:num>
   <w:num w:numId="22" w16cid:durableId="838277529">
-    <w:abstractNumId w:val="33"/>
+    <w:abstractNumId w:val="34"/>
   </w:num>
   <w:num w:numId="23" w16cid:durableId="526211933">
     <w:abstractNumId w:val="0"/>
   </w:num>
   <w:num w:numId="24" w16cid:durableId="586882763">
+    <w:abstractNumId w:val="30"/>
+  </w:num>
+  <w:num w:numId="25" w16cid:durableId="707678128">
+    <w:abstractNumId w:val="17"/>
+  </w:num>
+  <w:num w:numId="26" w16cid:durableId="740059617">
+    <w:abstractNumId w:val="42"/>
+  </w:num>
+  <w:num w:numId="27" w16cid:durableId="863902866">
+    <w:abstractNumId w:val="28"/>
+  </w:num>
+  <w:num w:numId="28" w16cid:durableId="1058746763">
+    <w:abstractNumId w:val="53"/>
+  </w:num>
+  <w:num w:numId="29" w16cid:durableId="91122657">
+    <w:abstractNumId w:val="38"/>
+  </w:num>
+  <w:num w:numId="30" w16cid:durableId="1339965505">
+    <w:abstractNumId w:val="25"/>
+  </w:num>
+  <w:num w:numId="31" w16cid:durableId="685324819">
+    <w:abstractNumId w:val="33"/>
+  </w:num>
+  <w:num w:numId="32" w16cid:durableId="1849561750">
+    <w:abstractNumId w:val="21"/>
+  </w:num>
+  <w:num w:numId="33" w16cid:durableId="1323201002">
+    <w:abstractNumId w:val="43"/>
+  </w:num>
+  <w:num w:numId="34" w16cid:durableId="1363824459">
+    <w:abstractNumId w:val="22"/>
+  </w:num>
+  <w:num w:numId="35" w16cid:durableId="1817145651">
     <w:abstractNumId w:val="29"/>
   </w:num>
-  <w:num w:numId="25" w16cid:durableId="707678128">
-    <w:abstractNumId w:val="16"/>
+  <w:num w:numId="36" w16cid:durableId="22442455">
+    <w:abstractNumId w:val="58"/>
   </w:num>
-  <w:num w:numId="26" w16cid:durableId="740059617">
+  <w:num w:numId="37" w16cid:durableId="1200507254">
+    <w:abstractNumId w:val="11"/>
+  </w:num>
+  <w:num w:numId="38" w16cid:durableId="538933990">
+    <w:abstractNumId w:val="45"/>
+  </w:num>
+  <w:num w:numId="39" w16cid:durableId="134300031">
+    <w:abstractNumId w:val="40"/>
+  </w:num>
+  <w:num w:numId="40" w16cid:durableId="648441948">
+    <w:abstractNumId w:val="49"/>
+  </w:num>
+  <w:num w:numId="41" w16cid:durableId="1100878890">
+    <w:abstractNumId w:val="56"/>
+  </w:num>
+  <w:num w:numId="42" w16cid:durableId="398404278">
+    <w:abstractNumId w:val="37"/>
+  </w:num>
+  <w:num w:numId="43" w16cid:durableId="1187869658">
+    <w:abstractNumId w:val="20"/>
+  </w:num>
+  <w:num w:numId="44" w16cid:durableId="303967971">
+    <w:abstractNumId w:val="15"/>
+  </w:num>
+  <w:num w:numId="45" w16cid:durableId="1676566553">
+    <w:abstractNumId w:val="26"/>
+  </w:num>
+  <w:num w:numId="46" w16cid:durableId="1547568886">
+    <w:abstractNumId w:val="52"/>
+  </w:num>
+  <w:num w:numId="47" w16cid:durableId="952057766">
+    <w:abstractNumId w:val="27"/>
+  </w:num>
+  <w:num w:numId="48" w16cid:durableId="1018583334">
     <w:abstractNumId w:val="41"/>
   </w:num>
-  <w:num w:numId="27" w16cid:durableId="863902866">
-    <w:abstractNumId w:val="27"/>
+  <w:num w:numId="49" w16cid:durableId="1194077249">
+    <w:abstractNumId w:val="47"/>
   </w:num>
-  <w:num w:numId="28" w16cid:durableId="1058746763">
-    <w:abstractNumId w:val="52"/>
+  <w:num w:numId="50" w16cid:durableId="501893233">
+    <w:abstractNumId w:val="55"/>
   </w:num>
-  <w:num w:numId="29" w16cid:durableId="91122657">
-    <w:abstractNumId w:val="37"/>
-  </w:num>
-  <w:num w:numId="30" w16cid:durableId="1339965505">
-    <w:abstractNumId w:val="24"/>
-  </w:num>
-  <w:num w:numId="31" w16cid:durableId="685324819">
-    <w:abstractNumId w:val="32"/>
-  </w:num>
-  <w:num w:numId="32" w16cid:durableId="1849561750">
-    <w:abstractNumId w:val="20"/>
-  </w:num>
-  <w:num w:numId="33" w16cid:durableId="1323201002">
-    <w:abstractNumId w:val="42"/>
-  </w:num>
-  <w:num w:numId="34" w16cid:durableId="1363824459">
-    <w:abstractNumId w:val="21"/>
-  </w:num>
-  <w:num w:numId="35" w16cid:durableId="1817145651">
-    <w:abstractNumId w:val="28"/>
-  </w:num>
-  <w:num w:numId="36" w16cid:durableId="22442455">
-    <w:abstractNumId w:val="57"/>
-  </w:num>
-  <w:num w:numId="37" w16cid:durableId="1200507254">
-    <w:abstractNumId w:val="10"/>
-  </w:num>
-  <w:num w:numId="38" w16cid:durableId="538933990">
-    <w:abstractNumId w:val="44"/>
-  </w:num>
-  <w:num w:numId="39" w16cid:durableId="134300031">
-    <w:abstractNumId w:val="39"/>
-  </w:num>
-  <w:num w:numId="40" w16cid:durableId="648441948">
+  <w:num w:numId="51" w16cid:durableId="340275757">
     <w:abstractNumId w:val="48"/>
   </w:num>
-  <w:num w:numId="41" w16cid:durableId="1100878890">
-    <w:abstractNumId w:val="55"/>
-  </w:num>
-  <w:num w:numId="42" w16cid:durableId="398404278">
-    <w:abstractNumId w:val="36"/>
-  </w:num>
-  <w:num w:numId="43" w16cid:durableId="1187869658">
-    <w:abstractNumId w:val="19"/>
-  </w:num>
-  <w:num w:numId="44" w16cid:durableId="303967971">
-    <w:abstractNumId w:val="14"/>
-  </w:num>
-  <w:num w:numId="45" w16cid:durableId="1676566553">
-    <w:abstractNumId w:val="25"/>
-  </w:num>
-  <w:num w:numId="46" w16cid:durableId="1547568886">
-    <w:abstractNumId w:val="51"/>
-  </w:num>
-  <w:num w:numId="47" w16cid:durableId="952057766">
-    <w:abstractNumId w:val="26"/>
-  </w:num>
-  <w:num w:numId="48" w16cid:durableId="1018583334">
-    <w:abstractNumId w:val="40"/>
-  </w:num>
-  <w:num w:numId="49" w16cid:durableId="1194077249">
-    <w:abstractNumId w:val="46"/>
-  </w:num>
-  <w:num w:numId="50" w16cid:durableId="501893233">
-    <w:abstractNumId w:val="54"/>
-  </w:num>
-  <w:num w:numId="51" w16cid:durableId="340275757">
-    <w:abstractNumId w:val="47"/>
-  </w:num>
   <w:num w:numId="52" w16cid:durableId="308751836">
-    <w:abstractNumId w:val="12"/>
+    <w:abstractNumId w:val="13"/>
   </w:num>
   <w:num w:numId="53" w16cid:durableId="1662585356">
     <w:abstractNumId w:val="6"/>
   </w:num>
   <w:num w:numId="54" w16cid:durableId="430244003">
-    <w:abstractNumId w:val="13"/>
+    <w:abstractNumId w:val="14"/>
   </w:num>
   <w:num w:numId="55" w16cid:durableId="1727099574">
     <w:abstractNumId w:val="3"/>
@@ -21290,7 +21356,10 @@
     <w:abstractNumId w:val="5"/>
   </w:num>
   <w:num w:numId="58" w16cid:durableId="2010595253">
-    <w:abstractNumId w:val="23"/>
+    <w:abstractNumId w:val="24"/>
+  </w:num>
+  <w:num w:numId="59" w16cid:durableId="841044163">
+    <w:abstractNumId w:val="10"/>
   </w:num>
   <w:numIdMacAtCleanup w:val="23"/>
 </w:numbering>
@@ -22419,7 +22488,7 @@
     <w:autoRedefine/>
     <w:uiPriority w:val="39"/>
     <w:unhideWhenUsed/>
-    <w:rsid w:val="006E125F"/>
+    <w:rsid w:val="001A194E"/>
     <w:pPr>
       <w:tabs>
         <w:tab w:val="left" w:pos="480"/>

</xml_diff>